<commit_message>
Align figures to final CV and serve the final CV download
Co-Authored-By: Claude Opus 5 (1M context) <noreply@anthropic.com>
</commit_message>
<xml_diff>
--- a/Rachit_Verma_CV.docx
+++ b/Rachit_Verma_CV.docx
@@ -4,324 +4,419 @@
   <w:body>
     <w:p>
       <w:pPr>
+        <w:spacing w:after="0"/>
+        <w:jc w:val="center"/>
+      </w:pPr>
+      <w:r>
+        <w:rPr>
+          <w:b/>
+          <w:color w:val="1F3A5F"/>
+          <w:sz w:val="42"/>
+        </w:rPr>
+        <w:t>RACHIT VERMA</w:t>
+      </w:r>
+    </w:p>
+    <w:p>
+      <w:pPr>
         <w:spacing w:after="20"/>
         <w:jc w:val="center"/>
+      </w:pPr>
+      <w:r>
         <w:rPr>
-          <w:rFonts w:ascii="Times New Roman" w:hAnsi="Times New Roman" w:cs="Times New Roman"/>
-          <w:sz w:val="20"/>
-          <w:szCs w:val="20"/>
+          <w:b/>
+          <w:sz w:val="21"/>
         </w:rPr>
-      </w:pPr>
+        <w:t xml:space="preserve">AVP </w:t>
+      </w:r>
+      <w:proofErr w:type="gramStart"/>
       <w:r>
         <w:rPr>
-          <w:rFonts w:ascii="Times New Roman" w:hAnsi="Times New Roman" w:cs="Times New Roman"/>
           <w:b/>
-          <w:sz w:val="20"/>
-          <w:szCs w:val="20"/>
+          <w:sz w:val="21"/>
         </w:rPr>
-        <w:t>RACHIT VERMA</w:t>
+        <w:t>Marketing  |</w:t>
+      </w:r>
+      <w:proofErr w:type="gramEnd"/>
+      <w:r>
+        <w:rPr>
+          <w:b/>
+          <w:sz w:val="21"/>
+        </w:rPr>
+        <w:t xml:space="preserve">  Head of </w:t>
+      </w:r>
+      <w:proofErr w:type="gramStart"/>
+      <w:r>
+        <w:rPr>
+          <w:b/>
+          <w:sz w:val="21"/>
+        </w:rPr>
+        <w:t>Marketing  |</w:t>
+      </w:r>
+      <w:proofErr w:type="gramEnd"/>
+      <w:r>
+        <w:rPr>
+          <w:b/>
+          <w:sz w:val="21"/>
+        </w:rPr>
+        <w:t xml:space="preserve">  B2B SaaS and Enterprise Technology</w:t>
       </w:r>
     </w:p>
     <w:p>
       <w:pPr>
         <w:spacing w:after="20"/>
         <w:jc w:val="center"/>
+      </w:pPr>
+      <w:r>
         <w:rPr>
-          <w:rFonts w:ascii="Times New Roman" w:hAnsi="Times New Roman" w:cs="Times New Roman"/>
-          <w:sz w:val="20"/>
-          <w:szCs w:val="20"/>
+          <w:color w:val="555F6B"/>
         </w:rPr>
-      </w:pPr>
+        <w:t xml:space="preserve">Gurugram, Delhi NCR, </w:t>
+      </w:r>
+      <w:proofErr w:type="gramStart"/>
       <w:r>
         <w:rPr>
-          <w:rFonts w:ascii="Times New Roman" w:hAnsi="Times New Roman" w:cs="Times New Roman"/>
-          <w:b/>
-          <w:sz w:val="20"/>
-          <w:szCs w:val="20"/>
+          <w:color w:val="555F6B"/>
         </w:rPr>
-        <w:t>Head of Marketing | AVP / VP Marketing | B2B SaaS and Enterprise Technology</w:t>
-      </w:r>
+        <w:t>India  |</w:t>
+      </w:r>
+      <w:proofErr w:type="gramEnd"/>
+      <w:r>
+        <w:rPr>
+          <w:color w:val="555F6B"/>
+        </w:rPr>
+        <w:t xml:space="preserve">  +91 99589 </w:t>
+      </w:r>
+      <w:proofErr w:type="gramStart"/>
+      <w:r>
+        <w:rPr>
+          <w:color w:val="555F6B"/>
+        </w:rPr>
+        <w:t>78720  |</w:t>
+      </w:r>
+      <w:proofErr w:type="gramEnd"/>
+      <w:r>
+        <w:rPr>
+          <w:color w:val="555F6B"/>
+        </w:rPr>
+        <w:t xml:space="preserve">  </w:t>
+      </w:r>
+      <w:hyperlink r:id="rId6">
+        <w:r>
+          <w:rPr>
+            <w:color w:val="1F3A5F"/>
+          </w:rPr>
+          <w:t>rv200588@gmail.com</w:t>
+        </w:r>
+      </w:hyperlink>
+      <w:r>
+        <w:rPr>
+          <w:color w:val="555F6B"/>
+        </w:rPr>
+        <w:t xml:space="preserve">  |  </w:t>
+      </w:r>
+      <w:hyperlink r:id="rId7">
+        <w:r>
+          <w:rPr>
+            <w:color w:val="1F3A5F"/>
+          </w:rPr>
+          <w:t>linkedin.com/in/rachitverma1</w:t>
+        </w:r>
+      </w:hyperlink>
     </w:p>
     <w:p>
       <w:pPr>
-        <w:spacing w:after="40"/>
-        <w:jc w:val="center"/>
+        <w:keepNext/>
+        <w:pBdr>
+          <w:bottom w:val="single" w:sz="6" w:space="1" w:color="1F3A5F"/>
+        </w:pBdr>
+        <w:spacing w:before="120" w:after="50"/>
+      </w:pPr>
+      <w:r>
         <w:rPr>
-          <w:rFonts w:ascii="Times New Roman" w:hAnsi="Times New Roman" w:cs="Times New Roman"/>
+          <w:b/>
+          <w:color w:val="1F3A5F"/>
+          <w:spacing w:val="20"/>
           <w:sz w:val="20"/>
-          <w:szCs w:val="20"/>
         </w:rPr>
-      </w:pPr>
-      <w:r>
-        <w:rPr>
-          <w:rFonts w:ascii="Times New Roman" w:hAnsi="Times New Roman" w:cs="Times New Roman"/>
-          <w:sz w:val="20"/>
-          <w:szCs w:val="20"/>
-        </w:rPr>
-        <w:t xml:space="preserve">Delhi NCR, </w:t>
-      </w:r>
-      <w:proofErr w:type="gramStart"/>
-      <w:r>
-        <w:rPr>
-          <w:rFonts w:ascii="Times New Roman" w:hAnsi="Times New Roman" w:cs="Times New Roman"/>
-          <w:sz w:val="20"/>
-          <w:szCs w:val="20"/>
-        </w:rPr>
-        <w:t>India  •</w:t>
-      </w:r>
-      <w:proofErr w:type="gramEnd"/>
-      <w:r>
-        <w:rPr>
-          <w:rFonts w:ascii="Times New Roman" w:hAnsi="Times New Roman" w:cs="Times New Roman"/>
-          <w:sz w:val="20"/>
-          <w:szCs w:val="20"/>
-        </w:rPr>
-        <w:t xml:space="preserve">  +91 99589 </w:t>
-      </w:r>
-      <w:proofErr w:type="gramStart"/>
-      <w:r>
-        <w:rPr>
-          <w:rFonts w:ascii="Times New Roman" w:hAnsi="Times New Roman" w:cs="Times New Roman"/>
-          <w:sz w:val="20"/>
-          <w:szCs w:val="20"/>
-        </w:rPr>
-        <w:t>78720  •</w:t>
-      </w:r>
-      <w:proofErr w:type="gramEnd"/>
-      <w:r>
-        <w:rPr>
-          <w:rFonts w:ascii="Times New Roman" w:hAnsi="Times New Roman" w:cs="Times New Roman"/>
-          <w:sz w:val="20"/>
-          <w:szCs w:val="20"/>
-        </w:rPr>
-        <w:t xml:space="preserve">  </w:t>
-      </w:r>
-      <w:proofErr w:type="gramStart"/>
-      <w:r>
-        <w:rPr>
-          <w:rFonts w:ascii="Times New Roman" w:hAnsi="Times New Roman" w:cs="Times New Roman"/>
-          <w:sz w:val="20"/>
-          <w:szCs w:val="20"/>
-        </w:rPr>
-        <w:t>rv200588@gmail.com  •</w:t>
-      </w:r>
-      <w:proofErr w:type="gramEnd"/>
-      <w:r>
-        <w:rPr>
-          <w:rFonts w:ascii="Times New Roman" w:hAnsi="Times New Roman" w:cs="Times New Roman"/>
-          <w:sz w:val="20"/>
-          <w:szCs w:val="20"/>
-        </w:rPr>
-        <w:t xml:space="preserve">  linkedin.com/in/rachitverma1</w:t>
+        <w:t>EXECUTIVE SUMMARY</w:t>
       </w:r>
     </w:p>
     <w:p>
       <w:pPr>
+        <w:spacing w:after="0"/>
+      </w:pPr>
+      <w:bookmarkStart w:id="0" w:name="OLE_LINK8"/>
+      <w:r>
+        <w:t xml:space="preserve">B2B marketing and go-to-market leader with 15+ years across enterprise IT, SaaS, FinTech, network services, compliance and supply chain technology. Built or rebuilt GTM functions from zero four times, from AgreeYa’s first digital function to BlueKaktus’ repositioning from ERP to AI-powered supply chain. Works backwards from revenue targets to build positioning, demand generation and sales enablement, and earns leadership trust to deliver board-level outcomes at speed. </w:t>
+      </w:r>
+      <w:r>
+        <w:t>PGP PRO</w:t>
+      </w:r>
+      <w:r>
+        <w:t>, Indian School of Business.</w:t>
+      </w:r>
+    </w:p>
+    <w:bookmarkEnd w:id="0"/>
+    <w:p>
+      <w:pPr>
+        <w:keepNext/>
         <w:pBdr>
-          <w:bottom w:val="single" w:sz="8" w:space="1" w:color="000000"/>
+          <w:bottom w:val="single" w:sz="6" w:space="1" w:color="1F3A5F"/>
         </w:pBdr>
-        <w:spacing w:before="112" w:after="28"/>
+        <w:spacing w:before="120" w:after="50"/>
+      </w:pPr>
+      <w:r>
         <w:rPr>
-          <w:rFonts w:ascii="Times New Roman" w:hAnsi="Times New Roman" w:cs="Times New Roman"/>
+          <w:b/>
+          <w:color w:val="1F3A5F"/>
+          <w:spacing w:val="20"/>
           <w:sz w:val="20"/>
-          <w:szCs w:val="20"/>
         </w:rPr>
-      </w:pPr>
-      <w:r>
-        <w:rPr>
-          <w:rFonts w:ascii="Times New Roman" w:hAnsi="Times New Roman" w:cs="Times New Roman"/>
-          <w:b/>
-          <w:color w:val="2E9BD8"/>
-          <w:sz w:val="20"/>
-          <w:szCs w:val="20"/>
-        </w:rPr>
-        <w:t>PROFESSIONAL SUMMARY</w:t>
+        <w:t>CORE SKILLS</w:t>
       </w:r>
     </w:p>
     <w:p>
       <w:pPr>
-        <w:spacing w:after="40"/>
+        <w:pStyle w:val="ListBullet"/>
+        <w:spacing w:after="20"/>
+      </w:pPr>
+      <w:r>
         <w:rPr>
-          <w:rFonts w:ascii="Times New Roman" w:hAnsi="Times New Roman" w:cs="Times New Roman"/>
-          <w:sz w:val="20"/>
-          <w:szCs w:val="20"/>
+          <w:b/>
+          <w:color w:val="1F3A5F"/>
         </w:rPr>
-      </w:pPr>
-      <w:r>
-        <w:rPr>
-          <w:rFonts w:ascii="Times New Roman" w:hAnsi="Times New Roman" w:cs="Times New Roman"/>
-          <w:sz w:val="20"/>
-          <w:szCs w:val="20"/>
-        </w:rPr>
-        <w:t>Senior B2B SaaS marketing leader with 15+ years across IT, NaaS, SaaS, fintech and logistics, driving mindshare through brand and category building and wallet share through full-funnel demand and revenue programmes. Consistent delivery of 30 to 35% gains in brand visibility, 40 to 45% lead growth and 20 to 30% improvement in sales conversion and revenue contribution. Proven in building marketing functions from scratch, defining segmentation, ICPs and buyer personas, and leading GTM, product marketing and sales enablement, supported by AI-enabled digital GTM, CRO and PLG foundations. Led multi-channel growth across LinkedIn, Google Search, email, ABM and partner ecosystems, improving lead-to-conversion by up to 35%, managing 15,000+ lead pipelines and improving retention by up to 40%. PGP PRO, Indian School of Business, specialising in Marketing and Strategy.</w:t>
+        <w:t xml:space="preserve">Go-to-Market and Product Marketing – </w:t>
+      </w:r>
+      <w:r>
+        <w:t>GTM strategy and positioning, brand positioning and messaging, product marketing and PLG strategy, ICP modelling and market segmentation, buyer persona development, sales enablement</w:t>
       </w:r>
     </w:p>
     <w:p>
       <w:pPr>
-        <w:pBdr>
-          <w:bottom w:val="single" w:sz="8" w:space="1" w:color="000000"/>
-        </w:pBdr>
-        <w:spacing w:before="112" w:after="28"/>
+        <w:pStyle w:val="ListBullet"/>
+        <w:spacing w:after="20"/>
+      </w:pPr>
+      <w:r>
         <w:rPr>
-          <w:rFonts w:ascii="Times New Roman" w:hAnsi="Times New Roman" w:cs="Times New Roman"/>
-          <w:sz w:val="20"/>
-          <w:szCs w:val="20"/>
+          <w:b/>
+          <w:color w:val="1F3A5F"/>
         </w:rPr>
-      </w:pPr>
-      <w:r>
-        <w:rPr>
-          <w:rFonts w:ascii="Times New Roman" w:hAnsi="Times New Roman" w:cs="Times New Roman"/>
-          <w:b/>
-          <w:color w:val="2E9BD8"/>
-          <w:sz w:val="20"/>
-          <w:szCs w:val="20"/>
-        </w:rPr>
-        <w:t>CORE SKILLS</w:t>
+        <w:t xml:space="preserve">Demand Generation and Revenue Marketing – </w:t>
+      </w:r>
+      <w:r>
+        <w:t xml:space="preserve">Demand generation and conversion </w:t>
+      </w:r>
+      <w:proofErr w:type="spellStart"/>
+      <w:r>
+        <w:t>optimisation</w:t>
+      </w:r>
+      <w:proofErr w:type="spellEnd"/>
+      <w:r>
+        <w:t>, funnel strategy and MQL-to-SQL conversion, account-based marketing and partner management, revenue growth and pipeline acceleration, customer lifecycle and retention strategy</w:t>
       </w:r>
     </w:p>
     <w:p>
       <w:pPr>
         <w:pStyle w:val="ListBullet"/>
+        <w:spacing w:after="20"/>
+      </w:pPr>
+      <w:r>
         <w:rPr>
-          <w:rFonts w:ascii="Times New Roman" w:hAnsi="Times New Roman" w:cs="Times New Roman"/>
-          <w:sz w:val="20"/>
-          <w:szCs w:val="20"/>
+          <w:b/>
+          <w:color w:val="1F3A5F"/>
         </w:rPr>
-      </w:pPr>
-      <w:r>
-        <w:rPr>
-          <w:rFonts w:ascii="Times New Roman" w:hAnsi="Times New Roman" w:cs="Times New Roman"/>
-          <w:sz w:val="20"/>
-          <w:szCs w:val="20"/>
-        </w:rPr>
-        <w:t>Go-to-Market and Product Marketing – GTM strategy and positioning, brand positioning and messaging, product marketing and PLG strategy, ICP modelling and market segmentation, buyer persona development, sales enablement</w:t>
+        <w:t xml:space="preserve">Digital and Integrated Campaigns – </w:t>
+      </w:r>
+      <w:r>
+        <w:t>Digital and performance marketing, Google and Bing Ads, SEO, email marketing design and automation, content strategy and engagement, social media strategy, integrated ATL, BTL, PR and event marketing, integrated marketing communications</w:t>
       </w:r>
     </w:p>
     <w:p>
       <w:pPr>
         <w:pStyle w:val="ListBullet"/>
+        <w:spacing w:after="20"/>
+      </w:pPr>
+      <w:proofErr w:type="spellStart"/>
+      <w:r>
         <w:rPr>
-          <w:rFonts w:ascii="Times New Roman" w:hAnsi="Times New Roman" w:cs="Times New Roman"/>
-          <w:sz w:val="20"/>
-          <w:szCs w:val="20"/>
+          <w:b/>
+          <w:color w:val="1F3A5F"/>
         </w:rPr>
-      </w:pPr>
+        <w:t>MarTech</w:t>
+      </w:r>
+      <w:proofErr w:type="spellEnd"/>
       <w:r>
         <w:rPr>
-          <w:rFonts w:ascii="Times New Roman" w:hAnsi="Times New Roman" w:cs="Times New Roman"/>
-          <w:sz w:val="20"/>
-          <w:szCs w:val="20"/>
+          <w:b/>
+          <w:color w:val="1F3A5F"/>
         </w:rPr>
-        <w:t>Demand Generation and Revenue Marketing – Demand generation and conversion optimisation, funnel strategy and MQL-to-SQL conversion, account-based marketing and partner management, revenue growth and pipeline acceleration, customer lifecycle and retention strategy</w:t>
+        <w:t xml:space="preserve">, Analytics and Leadership – </w:t>
+      </w:r>
+      <w:proofErr w:type="spellStart"/>
+      <w:r>
+        <w:t>MarTech</w:t>
+      </w:r>
+      <w:proofErr w:type="spellEnd"/>
+      <w:r>
+        <w:t xml:space="preserve"> stack and AI-driven automation, HubSpot, Google Analytics and heatmaps, CRO, attribution and reporting, building marketing functions from scratch, agency and stakeholder management, cross-functional alignment with founders, sales and product</w:t>
       </w:r>
     </w:p>
     <w:p>
       <w:pPr>
-        <w:pStyle w:val="ListBullet"/>
+        <w:keepNext/>
+        <w:pBdr>
+          <w:bottom w:val="single" w:sz="6" w:space="1" w:color="1F3A5F"/>
+        </w:pBdr>
+        <w:spacing w:before="120" w:after="50"/>
+      </w:pPr>
+      <w:r>
         <w:rPr>
-          <w:rFonts w:ascii="Times New Roman" w:hAnsi="Times New Roman" w:cs="Times New Roman"/>
+          <w:b/>
+          <w:color w:val="1F3A5F"/>
+          <w:spacing w:val="20"/>
           <w:sz w:val="20"/>
-          <w:szCs w:val="20"/>
         </w:rPr>
-      </w:pPr>
-      <w:r>
-        <w:rPr>
-          <w:rFonts w:ascii="Times New Roman" w:hAnsi="Times New Roman" w:cs="Times New Roman"/>
-          <w:sz w:val="20"/>
-          <w:szCs w:val="20"/>
-        </w:rPr>
-        <w:t>Digital and Integrated Campaigns – Digital and performance marketing, Google and Bing Ads, SEO, email marketing design and automation, content strategy and engagement, social media strategy, integrated ATL, BTL, PR and event marketing, integrated marketing communications</w:t>
+        <w:t>PROFESSIONAL EXPERIENCE</w:t>
       </w:r>
     </w:p>
     <w:p>
       <w:pPr>
-        <w:pStyle w:val="ListBullet"/>
-        <w:rPr>
-          <w:rFonts w:ascii="Times New Roman" w:hAnsi="Times New Roman" w:cs="Times New Roman"/>
-          <w:sz w:val="20"/>
-          <w:szCs w:val="20"/>
-        </w:rPr>
-      </w:pPr>
-      <w:r>
-        <w:rPr>
-          <w:rFonts w:ascii="Times New Roman" w:hAnsi="Times New Roman" w:cs="Times New Roman"/>
-          <w:sz w:val="20"/>
-          <w:szCs w:val="20"/>
-        </w:rPr>
-        <w:t>MarTech, Analytics and Leadership – MarTech stack and AI-driven automation, HubSpot, Google Analytics and heatmaps, CRO, attribution and reporting, building marketing functions from scratch, agency and stakeholder management, cross-functional alignment with founders, sales and product</w:t>
-      </w:r>
-    </w:p>
-    <w:p>
-      <w:pPr>
-        <w:pBdr>
-          <w:bottom w:val="single" w:sz="8" w:space="1" w:color="000000"/>
-        </w:pBdr>
-        <w:spacing w:before="112" w:after="28"/>
-        <w:rPr>
-          <w:rFonts w:ascii="Times New Roman" w:hAnsi="Times New Roman" w:cs="Times New Roman"/>
-          <w:sz w:val="20"/>
-          <w:szCs w:val="20"/>
-        </w:rPr>
-      </w:pPr>
-      <w:r>
-        <w:rPr>
-          <w:rFonts w:ascii="Times New Roman" w:hAnsi="Times New Roman" w:cs="Times New Roman"/>
-          <w:b/>
-          <w:color w:val="2E9BD8"/>
-          <w:sz w:val="20"/>
-          <w:szCs w:val="20"/>
-        </w:rPr>
-        <w:t>PROFESSIONAL EXPERIENCE</w:t>
-      </w:r>
-    </w:p>
-    <w:p>
-      <w:pPr>
-        <w:spacing w:before="84"/>
-        <w:rPr>
-          <w:rFonts w:ascii="Times New Roman" w:hAnsi="Times New Roman" w:cs="Times New Roman"/>
-          <w:sz w:val="20"/>
-          <w:szCs w:val="20"/>
-        </w:rPr>
-      </w:pPr>
-      <w:r>
-        <w:rPr>
-          <w:rFonts w:ascii="Times New Roman" w:hAnsi="Times New Roman" w:cs="Times New Roman"/>
-          <w:b/>
-          <w:sz w:val="20"/>
-          <w:szCs w:val="20"/>
-        </w:rPr>
-        <w:t>BlueKaktus</w:t>
-      </w:r>
-    </w:p>
-    <w:p>
-      <w:pPr>
+        <w:keepNext/>
         <w:tabs>
           <w:tab w:val="right" w:pos="10469"/>
         </w:tabs>
-        <w:spacing w:before="56" w:after="14"/>
+        <w:spacing w:after="20"/>
+      </w:pPr>
+      <w:r>
         <w:rPr>
-          <w:rFonts w:ascii="Times New Roman" w:hAnsi="Times New Roman" w:cs="Times New Roman"/>
+          <w:b/>
+          <w:color w:val="1F3A5F"/>
           <w:sz w:val="20"/>
-          <w:szCs w:val="20"/>
         </w:rPr>
-      </w:pPr>
+        <w:t>Independent Marketing and GTM Consultant</w:t>
+      </w:r>
       <w:r>
         <w:rPr>
-          <w:rFonts w:ascii="Times New Roman" w:hAnsi="Times New Roman" w:cs="Times New Roman"/>
           <w:b/>
-          <w:i/>
+          <w:color w:val="1F3A5F"/>
           <w:sz w:val="20"/>
-          <w:szCs w:val="20"/>
         </w:rPr>
-        <w:t>AVP, Marketing</w:t>
+        <w:t xml:space="preserve"> | </w:t>
       </w:r>
       <w:r>
         <w:rPr>
-          <w:rFonts w:ascii="Times New Roman" w:hAnsi="Times New Roman" w:cs="Times New Roman"/>
           <w:b/>
-          <w:i/>
           <w:sz w:val="20"/>
-          <w:szCs w:val="20"/>
+        </w:rPr>
+        <w:t>OHI</w:t>
+      </w:r>
+      <w:r>
+        <w:rPr>
+          <w:sz w:val="20"/>
+        </w:rPr>
+        <w:t>, New Delhi</w:t>
+      </w:r>
+      <w:r>
+        <w:rPr>
+          <w:b/>
+          <w:color w:val="555F6B"/>
+          <w:sz w:val="19"/>
+        </w:rPr>
+        <w:tab/>
+      </w:r>
+      <w:r>
+        <w:rPr>
+          <w:b/>
+          <w:color w:val="555F6B"/>
+          <w:sz w:val="19"/>
+        </w:rPr>
+        <w:t>May</w:t>
+      </w:r>
+      <w:r>
+        <w:rPr>
+          <w:b/>
+          <w:color w:val="555F6B"/>
+          <w:sz w:val="19"/>
+        </w:rPr>
+        <w:t xml:space="preserve"> 2026 – Present</w:t>
+      </w:r>
+    </w:p>
+    <w:p>
+      <w:pPr>
+        <w:pStyle w:val="ListBullet"/>
+        <w:spacing w:after="20"/>
+      </w:pPr>
+      <w:r>
+        <w:t>Engaged by a real estate financial services firm to set up its sustainability arm and take it to market: category positioning, ICP and buyer definition, service proposition, pricing narrative and the launch go-to-market plan.</w:t>
+      </w:r>
+    </w:p>
+    <w:p>
+      <w:pPr>
+        <w:keepNext/>
+        <w:tabs>
+          <w:tab w:val="right" w:pos="10469"/>
+        </w:tabs>
+        <w:spacing w:before="80" w:after="0"/>
+      </w:pPr>
+      <w:r>
+        <w:rPr>
+          <w:b/>
+          <w:color w:val="1F3A5F"/>
+          <w:sz w:val="20"/>
+        </w:rPr>
+        <w:t xml:space="preserve">AVP, </w:t>
+      </w:r>
+      <w:r>
+        <w:rPr>
+          <w:b/>
+          <w:color w:val="1F3A5F"/>
+          <w:sz w:val="20"/>
+        </w:rPr>
+        <w:t>Marketing</w:t>
+      </w:r>
+      <w:r>
+        <w:rPr>
+          <w:color w:val="555F6B"/>
+          <w:sz w:val="20"/>
+        </w:rPr>
+        <w:t xml:space="preserve"> | </w:t>
+      </w:r>
+      <w:r>
+        <w:rPr>
+          <w:b/>
+          <w:bCs/>
+          <w:color w:val="000000" w:themeColor="text1"/>
+          <w:sz w:val="20"/>
+        </w:rPr>
+        <w:t>BlueKaktus</w:t>
+      </w:r>
+      <w:r>
+        <w:rPr>
+          <w:b/>
+          <w:bCs/>
+          <w:color w:val="000000" w:themeColor="text1"/>
+          <w:sz w:val="20"/>
+        </w:rPr>
+        <w:t>,</w:t>
+      </w:r>
+      <w:r>
+        <w:rPr>
+          <w:color w:val="000000" w:themeColor="text1"/>
+          <w:sz w:val="20"/>
+        </w:rPr>
+        <w:t xml:space="preserve"> </w:t>
+      </w:r>
+      <w:r>
+        <w:rPr>
+          <w:sz w:val="20"/>
+        </w:rPr>
+        <w:t>Gurugram</w:t>
+      </w:r>
+      <w:r>
+        <w:rPr>
+          <w:b/>
+          <w:color w:val="555F6B"/>
+          <w:sz w:val="19"/>
         </w:rPr>
         <w:tab/>
         <w:t>Jun 2025 – Dec 2025</w:t>
@@ -329,161 +424,202 @@
     </w:p>
     <w:p>
       <w:pPr>
-        <w:spacing w:before="14" w:after="14"/>
+        <w:keepNext/>
+        <w:spacing w:after="20"/>
+      </w:pPr>
+      <w:r>
         <w:rPr>
-          <w:rFonts w:ascii="Times New Roman" w:hAnsi="Times New Roman" w:cs="Times New Roman"/>
-          <w:sz w:val="20"/>
-          <w:szCs w:val="20"/>
+          <w:i/>
+          <w:color w:val="555F6B"/>
         </w:rPr>
-      </w:pPr>
-      <w:r>
-        <w:rPr>
-          <w:rFonts w:ascii="Times New Roman" w:hAnsi="Times New Roman" w:cs="Times New Roman"/>
-          <w:i/>
-          <w:sz w:val="20"/>
-          <w:szCs w:val="20"/>
-        </w:rPr>
-        <w:t>Hired to build the marketing function and GTM foundation during a rapid product and market expansion phase across three enterprise verticals.</w:t>
+        <w:t>AI supply chain platform and ERP for the fashion industry.</w:t>
       </w:r>
     </w:p>
     <w:p>
       <w:pPr>
         <w:pStyle w:val="ListBullet"/>
-        <w:rPr>
-          <w:rFonts w:ascii="Times New Roman" w:hAnsi="Times New Roman" w:cs="Times New Roman"/>
-          <w:sz w:val="20"/>
-          <w:szCs w:val="20"/>
-        </w:rPr>
-      </w:pPr>
-      <w:r>
-        <w:rPr>
-          <w:rFonts w:ascii="Times New Roman" w:hAnsi="Times New Roman" w:cs="Times New Roman"/>
-          <w:sz w:val="20"/>
-          <w:szCs w:val="20"/>
-        </w:rPr>
-        <w:t>Established the marketing function from zero, setting strategy, frameworks and SOPs across branding, content, social, SEO and lead generation, and building GTM playbooks, ICPs and personas across Manufacturing (ERP), Sourcing (Platform) and Velocity (AI) for enterprise sales in India and global markets.</w:t>
+        <w:spacing w:after="20"/>
+      </w:pPr>
+      <w:r>
+        <w:t>Set the marketing strategy and built the function from zero across three enterprise product lines (Manufacturing ERP, Sourcing Platform, Velocity AI): frameworks and SOPs across brand, content, social, SEO and demand generation, and GTM playbooks for enterprise sales in India and global markets.</w:t>
       </w:r>
     </w:p>
     <w:p>
       <w:pPr>
         <w:pStyle w:val="ListBullet"/>
-        <w:rPr>
-          <w:rFonts w:ascii="Times New Roman" w:hAnsi="Times New Roman" w:cs="Times New Roman"/>
-          <w:sz w:val="20"/>
-          <w:szCs w:val="20"/>
-        </w:rPr>
-      </w:pPr>
-      <w:r>
-        <w:rPr>
-          <w:rFonts w:ascii="Times New Roman" w:hAnsi="Times New Roman" w:cs="Times New Roman"/>
-          <w:sz w:val="20"/>
-          <w:szCs w:val="20"/>
-        </w:rPr>
-        <w:t>Owned positioning, messaging and PLG strategy, led digital GTM and buyer journey design across company and product microsites, and translated product roadmaps into 15+ sales and launch assets including pitch decks, battle cards and feature stories.</w:t>
+        <w:spacing w:after="20"/>
+      </w:pPr>
+      <w:r>
+        <w:t xml:space="preserve">Repositioned the company in one month from ERP tool to AI-powered supply chain platform </w:t>
+      </w:r>
+      <w:r>
+        <w:t xml:space="preserve">across websites, content and channels. </w:t>
       </w:r>
     </w:p>
     <w:p>
       <w:pPr>
         <w:pStyle w:val="ListBullet"/>
-        <w:rPr>
-          <w:rFonts w:ascii="Times New Roman" w:hAnsi="Times New Roman" w:cs="Times New Roman"/>
-          <w:sz w:val="20"/>
-          <w:szCs w:val="20"/>
-        </w:rPr>
-      </w:pPr>
-      <w:r>
-        <w:rPr>
-          <w:rFonts w:ascii="Times New Roman" w:hAnsi="Times New Roman" w:cs="Times New Roman"/>
-          <w:sz w:val="20"/>
-          <w:szCs w:val="20"/>
-        </w:rPr>
-        <w:t>Built a multi-channel demand and partner engine across LinkedIn Ads, Google Search, email, remarketing, outbound drips, marketplaces (G2, Capterra, Gartner, SoftwareSuggest) and partner webinars, aligned to enterprise sales motions and early pipeline activation.</w:t>
+        <w:spacing w:after="20"/>
+      </w:pPr>
+      <w:r>
+        <w:t>Defined the ICP</w:t>
+      </w:r>
+      <w:r>
+        <w:t xml:space="preserve">, positioning and the messaging house for </w:t>
+      </w:r>
+      <w:r>
+        <w:t xml:space="preserve">a four-role buying committee (VP Supply Chain, Merchandising Head, Planner, CEO), </w:t>
+      </w:r>
+      <w:r>
+        <w:t xml:space="preserve">across campaigns. </w:t>
       </w:r>
     </w:p>
     <w:p>
       <w:pPr>
         <w:pStyle w:val="ListBullet"/>
-        <w:rPr>
-          <w:rFonts w:ascii="Times New Roman" w:hAnsi="Times New Roman" w:cs="Times New Roman"/>
-          <w:sz w:val="20"/>
-          <w:szCs w:val="20"/>
-        </w:rPr>
-      </w:pPr>
-      <w:r>
-        <w:rPr>
-          <w:rFonts w:ascii="Times New Roman" w:hAnsi="Times New Roman" w:cs="Times New Roman"/>
-          <w:sz w:val="20"/>
-          <w:szCs w:val="20"/>
-        </w:rPr>
-        <w:t>Led the redesign of company and vertical websites, defining buyer journeys, SEO foundations, conversion flows and attribution using Google Analytics and heatmaps to improve funnel visibility.</w:t>
+        <w:spacing w:after="20"/>
+      </w:pPr>
+      <w:r>
+        <w:t xml:space="preserve">Rebuilt demand generation around the buying committee across LinkedIn Ads, Google Search, email, remarketing, outbound sequences, review marketplaces (G2, Capterra, Gartner, </w:t>
+      </w:r>
+      <w:proofErr w:type="spellStart"/>
+      <w:r>
+        <w:t>SoftwareSuggest</w:t>
+      </w:r>
+      <w:proofErr w:type="spellEnd"/>
+      <w:r>
+        <w:t>) and partner webinars</w:t>
+      </w:r>
+      <w:r>
+        <w:t>.</w:t>
       </w:r>
     </w:p>
     <w:p>
       <w:pPr>
         <w:pStyle w:val="ListBullet"/>
-        <w:rPr>
-          <w:rFonts w:ascii="Times New Roman" w:hAnsi="Times New Roman" w:cs="Times New Roman"/>
-          <w:sz w:val="20"/>
-          <w:szCs w:val="20"/>
-        </w:rPr>
-      </w:pPr>
-      <w:r>
-        <w:rPr>
-          <w:rFonts w:ascii="Times New Roman" w:hAnsi="Times New Roman" w:cs="Times New Roman"/>
-          <w:sz w:val="20"/>
-          <w:szCs w:val="20"/>
-        </w:rPr>
-        <w:t>Drove alignment across founders, product, sales and agencies to execute GTM programmes, sales-stage content, case studies, PR and video campaigns with a clear execution cadence.</w:t>
+        <w:spacing w:after="20"/>
+      </w:pPr>
+      <w:r>
+        <w:t>Launched the company's first paid media budget with a full-funnel plan covering target cost per lead, MQL and SQL mapping and the sales handover, establishing a baseline of 25–30 leads a month.</w:t>
       </w:r>
     </w:p>
     <w:p>
       <w:pPr>
-        <w:spacing w:before="84"/>
-        <w:rPr>
-          <w:rFonts w:ascii="Times New Roman" w:hAnsi="Times New Roman" w:cs="Times New Roman"/>
-          <w:sz w:val="20"/>
-          <w:szCs w:val="20"/>
-        </w:rPr>
-      </w:pPr>
-      <w:r>
-        <w:rPr>
-          <w:rFonts w:ascii="Times New Roman" w:hAnsi="Times New Roman" w:cs="Times New Roman"/>
-          <w:b/>
-          <w:sz w:val="20"/>
-          <w:szCs w:val="20"/>
-        </w:rPr>
-        <w:t>NayaOne</w:t>
+        <w:pStyle w:val="ListBullet"/>
+        <w:spacing w:after="20"/>
+      </w:pPr>
+      <w:r>
+        <w:t xml:space="preserve">Built the </w:t>
+      </w:r>
+      <w:r>
+        <w:t xml:space="preserve">sales </w:t>
+      </w:r>
+      <w:r>
+        <w:t>enablement library from nothing: customer case studies from none to 10+, battle cards, competitor comparisons, product videos and custom deal decks, kept current through a fortnightly sales and marketing cadence.</w:t>
       </w:r>
     </w:p>
     <w:p>
       <w:pPr>
+        <w:pStyle w:val="ListBullet"/>
+        <w:spacing w:after="20"/>
+      </w:pPr>
+      <w:r>
+        <w:t xml:space="preserve">Rebuilt the company and vertical websites around buyer journeys, </w:t>
+      </w:r>
+      <w:r>
+        <w:t>including UI, UX, design and</w:t>
+      </w:r>
+      <w:r>
+        <w:t xml:space="preserve"> content, and set up SEO and attribution through Google Analytics and heatmaps, directing two agencies to a fixed deadline.</w:t>
+      </w:r>
+    </w:p>
+    <w:p>
+      <w:pPr>
+        <w:pStyle w:val="ListBullet"/>
+        <w:rPr>
+          <w:lang w:val="en-IN" w:eastAsia="en-GB"/>
+        </w:rPr>
+      </w:pPr>
+      <w:r>
+        <w:rPr>
+          <w:lang w:val="en-IN" w:eastAsia="en-GB"/>
+        </w:rPr>
+        <w:t>Ran an AI-augmented marketing operation using Instantly, Claude, ChatGPT and Canva, with weekly data-driven optimisation</w:t>
+      </w:r>
+      <w:r>
+        <w:rPr>
+          <w:lang w:val="en-IN" w:eastAsia="en-GB"/>
+        </w:rPr>
+        <w:t>.</w:t>
+      </w:r>
+    </w:p>
+    <w:p>
+      <w:pPr>
+        <w:keepNext/>
         <w:tabs>
           <w:tab w:val="right" w:pos="10469"/>
         </w:tabs>
-        <w:spacing w:before="56" w:after="14"/>
+        <w:spacing w:before="80" w:after="0"/>
+      </w:pPr>
+      <w:r>
         <w:rPr>
-          <w:rFonts w:ascii="Times New Roman" w:hAnsi="Times New Roman" w:cs="Times New Roman"/>
+          <w:b/>
+          <w:color w:val="1F3A5F"/>
           <w:sz w:val="20"/>
-          <w:szCs w:val="20"/>
         </w:rPr>
-      </w:pPr>
+        <w:t xml:space="preserve">Senior Manager, </w:t>
+      </w:r>
       <w:r>
         <w:rPr>
-          <w:rFonts w:ascii="Times New Roman" w:hAnsi="Times New Roman" w:cs="Times New Roman"/>
           <w:b/>
-          <w:i/>
+          <w:color w:val="1F3A5F"/>
           <w:sz w:val="20"/>
-          <w:szCs w:val="20"/>
         </w:rPr>
-        <w:t>Senior Manager, Marketing</w:t>
+        <w:t>Marketing</w:t>
       </w:r>
       <w:r>
         <w:rPr>
-          <w:rFonts w:ascii="Times New Roman" w:hAnsi="Times New Roman" w:cs="Times New Roman"/>
+          <w:color w:val="555F6B"/>
+          <w:sz w:val="20"/>
+        </w:rPr>
+        <w:t xml:space="preserve"> </w:t>
+      </w:r>
+      <w:proofErr w:type="gramStart"/>
+      <w:r>
+        <w:rPr>
+          <w:color w:val="555F6B"/>
+          <w:sz w:val="20"/>
+        </w:rPr>
+        <w:t>|</w:t>
+      </w:r>
+      <w:r>
+        <w:rPr>
+          <w:color w:val="555F6B"/>
+          <w:sz w:val="20"/>
+        </w:rPr>
+        <w:t xml:space="preserve">  </w:t>
+      </w:r>
+      <w:proofErr w:type="spellStart"/>
+      <w:r>
+        <w:rPr>
           <w:b/>
-          <w:i/>
           <w:sz w:val="20"/>
-          <w:szCs w:val="20"/>
+        </w:rPr>
+        <w:t>NayaOne</w:t>
+      </w:r>
+      <w:proofErr w:type="spellEnd"/>
+      <w:proofErr w:type="gramEnd"/>
+      <w:r>
+        <w:rPr>
+          <w:sz w:val="20"/>
+        </w:rPr>
+        <w:t>, London and India</w:t>
+      </w:r>
+      <w:r>
+        <w:rPr>
+          <w:b/>
+          <w:color w:val="555F6B"/>
+          <w:sz w:val="19"/>
         </w:rPr>
         <w:tab/>
         <w:t>Oct 2024 – Jun 2025</w:t>
@@ -491,664 +627,998 @@
     </w:p>
     <w:p>
       <w:pPr>
-        <w:pStyle w:val="ListBullet"/>
+        <w:keepNext/>
+        <w:spacing w:after="20"/>
+      </w:pPr>
+      <w:r>
         <w:rPr>
-          <w:rFonts w:ascii="Times New Roman" w:hAnsi="Times New Roman" w:cs="Times New Roman"/>
-          <w:sz w:val="20"/>
-          <w:szCs w:val="20"/>
+          <w:i/>
+          <w:color w:val="555F6B"/>
         </w:rPr>
-      </w:pPr>
-      <w:r>
-        <w:rPr>
-          <w:rFonts w:ascii="Times New Roman" w:hAnsi="Times New Roman" w:cs="Times New Roman"/>
-          <w:sz w:val="20"/>
-          <w:szCs w:val="20"/>
-        </w:rPr>
-        <w:t>Led data-driven multi-channel demand programmes across paid, organic and outbound channels, improving lead-to-conversion rates by 35% and strengthening marketing-sourced pipeline contribution in a high-growth fintech SaaS environment.</w:t>
+        <w:t>Digital sandbox platform for banks and financial institutions.</w:t>
       </w:r>
     </w:p>
     <w:p>
       <w:pPr>
         <w:pStyle w:val="ListBullet"/>
-        <w:rPr>
-          <w:rFonts w:ascii="Times New Roman" w:hAnsi="Times New Roman" w:cs="Times New Roman"/>
-          <w:sz w:val="20"/>
-          <w:szCs w:val="20"/>
-        </w:rPr>
-      </w:pPr>
-      <w:r>
-        <w:rPr>
-          <w:rFonts w:ascii="Times New Roman" w:hAnsi="Times New Roman" w:cs="Times New Roman"/>
-          <w:sz w:val="20"/>
-          <w:szCs w:val="20"/>
-        </w:rPr>
-        <w:t>Partnered with sales to refine ICP targeting, lead qualification and messaging, improving SQL quality and enabling faster movement from MQL to opportunity across priority accounts.</w:t>
+      </w:pPr>
+      <w:r>
+        <w:t xml:space="preserve">Led data-driven, multi-channel demand </w:t>
+      </w:r>
+      <w:proofErr w:type="spellStart"/>
+      <w:r>
+        <w:t>programmes</w:t>
+      </w:r>
+      <w:proofErr w:type="spellEnd"/>
+      <w:r>
+        <w:t xml:space="preserve"> across paid, organic and outbound, improving lead-to-conversion rates by 35% and strengthening marketing-sourced pipeline contribution.</w:t>
       </w:r>
     </w:p>
     <w:p>
       <w:pPr>
         <w:pStyle w:val="ListBullet"/>
-        <w:rPr>
-          <w:rFonts w:ascii="Times New Roman" w:hAnsi="Times New Roman" w:cs="Times New Roman"/>
-          <w:sz w:val="20"/>
-          <w:szCs w:val="20"/>
-        </w:rPr>
-      </w:pPr>
-      <w:r>
-        <w:rPr>
-          <w:rFonts w:ascii="Times New Roman" w:hAnsi="Times New Roman" w:cs="Times New Roman"/>
-          <w:sz w:val="20"/>
-          <w:szCs w:val="20"/>
-        </w:rPr>
-        <w:t>Built high-intent content assets including case studies, newsletters and social campaigns aligned to buyer stages, driving 30% growth in digital engagement.</w:t>
+        <w:spacing w:after="20"/>
+      </w:pPr>
+      <w:r>
+        <w:t xml:space="preserve">Managed </w:t>
+      </w:r>
+      <w:r>
+        <w:t xml:space="preserve">a </w:t>
+      </w:r>
+      <w:r>
+        <w:t xml:space="preserve">successful content-led campaign to refill a stalled </w:t>
+      </w:r>
+      <w:proofErr w:type="gramStart"/>
+      <w:r>
+        <w:t>funnel:</w:t>
+      </w:r>
+      <w:proofErr w:type="gramEnd"/>
+      <w:r>
+        <w:t xml:space="preserve"> wrote the white paper and structured the TechTarget deal to return 50 named in-market buyers at Tier-1 financial institutions for £3,000.</w:t>
       </w:r>
     </w:p>
     <w:p>
       <w:pPr>
         <w:pStyle w:val="ListBullet"/>
-        <w:rPr>
-          <w:rFonts w:ascii="Times New Roman" w:hAnsi="Times New Roman" w:cs="Times New Roman"/>
-          <w:sz w:val="20"/>
-          <w:szCs w:val="20"/>
-        </w:rPr>
-      </w:pPr>
-      <w:r>
-        <w:rPr>
-          <w:rFonts w:ascii="Times New Roman" w:hAnsi="Times New Roman" w:cs="Times New Roman"/>
-          <w:sz w:val="20"/>
-          <w:szCs w:val="20"/>
-        </w:rPr>
-        <w:t>Owned end-to-end event and webinar strategy to engage decision-makers, generating a 25% increase in qualified leads and supporting enterprise account penetration.</w:t>
+        <w:spacing w:after="20"/>
+      </w:pPr>
+      <w:r>
+        <w:t>Redefined the ICP with sales and moved to intent-based qualifiers, improving SQL quality and speeding MQL-to-opportunity conversion across priority accounts.</w:t>
       </w:r>
     </w:p>
     <w:p>
       <w:pPr>
         <w:pStyle w:val="ListBullet"/>
-        <w:rPr>
-          <w:rFonts w:ascii="Times New Roman" w:hAnsi="Times New Roman" w:cs="Times New Roman"/>
-          <w:sz w:val="20"/>
-          <w:szCs w:val="20"/>
-        </w:rPr>
-      </w:pPr>
-      <w:r>
-        <w:rPr>
-          <w:rFonts w:ascii="Times New Roman" w:hAnsi="Times New Roman" w:cs="Times New Roman"/>
-          <w:sz w:val="20"/>
-          <w:szCs w:val="20"/>
-        </w:rPr>
-        <w:lastRenderedPageBreak/>
-        <w:t>Streamlined campaign workflows and reporting, reducing execution inefficiencies by 20% and improving visibility into funnel performance and channel ROI.</w:t>
+      </w:pPr>
+      <w:r>
+        <w:t xml:space="preserve">Owned content and partnership communications across case studies, white papers, newsletters and social, including announcements for NVIDIA, </w:t>
+      </w:r>
+      <w:proofErr w:type="spellStart"/>
+      <w:r>
+        <w:t>Akbank</w:t>
+      </w:r>
+      <w:proofErr w:type="spellEnd"/>
+      <w:r>
+        <w:t xml:space="preserve"> LAB and the World Economic Forum </w:t>
+      </w:r>
+      <w:proofErr w:type="spellStart"/>
+      <w:r>
+        <w:t>TradeTech</w:t>
+      </w:r>
+      <w:proofErr w:type="spellEnd"/>
+      <w:r>
+        <w:t xml:space="preserve"> Regulatory Sandbox, driving 30% growth in digital engagement.</w:t>
       </w:r>
     </w:p>
     <w:p>
       <w:pPr>
-        <w:spacing w:before="84"/>
-        <w:rPr>
-          <w:rFonts w:ascii="Times New Roman" w:hAnsi="Times New Roman" w:cs="Times New Roman"/>
-          <w:sz w:val="20"/>
-          <w:szCs w:val="20"/>
-        </w:rPr>
-      </w:pPr>
-      <w:r>
-        <w:rPr>
-          <w:rFonts w:ascii="Times New Roman" w:hAnsi="Times New Roman" w:cs="Times New Roman"/>
-          <w:b/>
-          <w:sz w:val="20"/>
-          <w:szCs w:val="20"/>
-        </w:rPr>
-        <w:t>Shyam Spectra Private Limited</w:t>
+        <w:pStyle w:val="ListBullet"/>
+      </w:pPr>
+      <w:r>
+        <w:t>Owned end-to-end event and webinar strategy to engage decision-makers, generating a 25% increase in qualified leads, and streamlined campaign workflows and reporting, reducing execution inefficiencies by 20%.</w:t>
       </w:r>
     </w:p>
     <w:p>
       <w:pPr>
+        <w:pStyle w:val="ListBullet"/>
+        <w:numPr>
+          <w:ilvl w:val="0"/>
+          <w:numId w:val="0"/>
+        </w:numPr>
+      </w:pPr>
+      <w:r>
+        <w:br/>
+      </w:r>
+      <w:r>
+        <w:rPr>
+          <w:b/>
+          <w:color w:val="1F3A5F"/>
+          <w:sz w:val="20"/>
+        </w:rPr>
+        <w:t xml:space="preserve">Senior Manager, </w:t>
+      </w:r>
+      <w:r>
+        <w:rPr>
+          <w:b/>
+          <w:color w:val="1F3A5F"/>
+          <w:sz w:val="20"/>
+        </w:rPr>
+        <w:t>Marketing</w:t>
+      </w:r>
+      <w:r>
+        <w:rPr>
+          <w:color w:val="555F6B"/>
+          <w:sz w:val="20"/>
+        </w:rPr>
+        <w:t xml:space="preserve"> | </w:t>
+      </w:r>
+      <w:r>
+        <w:rPr>
+          <w:b/>
+          <w:bCs/>
+          <w:color w:val="000000" w:themeColor="text1"/>
+          <w:sz w:val="20"/>
+        </w:rPr>
+        <w:t>Shyam</w:t>
+      </w:r>
+      <w:r>
+        <w:rPr>
+          <w:b/>
+          <w:bCs/>
+          <w:color w:val="000000" w:themeColor="text1"/>
+          <w:sz w:val="20"/>
+        </w:rPr>
+        <w:t xml:space="preserve"> Spectra, Gurugram</w:t>
+      </w:r>
+      <w:r>
+        <w:rPr>
+          <w:b/>
+          <w:color w:val="555F6B"/>
+          <w:sz w:val="19"/>
+        </w:rPr>
+        <w:tab/>
+      </w:r>
+      <w:r>
+        <w:rPr>
+          <w:b/>
+          <w:color w:val="555F6B"/>
+          <w:sz w:val="19"/>
+        </w:rPr>
+        <w:tab/>
+      </w:r>
+      <w:r>
+        <w:rPr>
+          <w:b/>
+          <w:color w:val="555F6B"/>
+          <w:sz w:val="19"/>
+        </w:rPr>
+        <w:tab/>
+      </w:r>
+      <w:r>
+        <w:rPr>
+          <w:b/>
+          <w:color w:val="555F6B"/>
+          <w:sz w:val="19"/>
+        </w:rPr>
+        <w:tab/>
+      </w:r>
+      <w:r>
+        <w:rPr>
+          <w:b/>
+          <w:color w:val="555F6B"/>
+          <w:sz w:val="19"/>
+        </w:rPr>
+        <w:tab/>
+      </w:r>
+      <w:r>
+        <w:rPr>
+          <w:b/>
+          <w:color w:val="555F6B"/>
+          <w:sz w:val="19"/>
+        </w:rPr>
+        <w:tab/>
+      </w:r>
+      <w:r>
+        <w:rPr>
+          <w:b/>
+          <w:color w:val="555F6B"/>
+          <w:sz w:val="19"/>
+        </w:rPr>
+        <w:t>May 2022 – Sep 2024</w:t>
+      </w:r>
+      <w:r>
+        <w:rPr>
+          <w:b/>
+          <w:color w:val="555F6B"/>
+          <w:sz w:val="19"/>
+        </w:rPr>
+        <w:br/>
+      </w:r>
+      <w:r>
+        <w:rPr>
+          <w:i/>
+          <w:color w:val="555F6B"/>
+        </w:rPr>
+        <w:t>Enterprise connectivity and network services provider.</w:t>
+      </w:r>
+    </w:p>
+    <w:p>
+      <w:pPr>
+        <w:pStyle w:val="ListBullet"/>
+        <w:spacing w:after="20"/>
+      </w:pPr>
+      <w:r>
+        <w:t>Orchestrated the pivot from B2C to B2B, rebuilding positioning for an enterprise buyer from a base of zero business recognition and increasing brand visibility by 35% through integrated PR, social media and events</w:t>
+      </w:r>
+      <w:r>
+        <w:t xml:space="preserve">. </w:t>
+      </w:r>
+    </w:p>
+    <w:p>
+      <w:pPr>
+        <w:pStyle w:val="ListBullet"/>
+        <w:spacing w:after="20"/>
+      </w:pPr>
+      <w:r>
+        <w:t>Built a multi-channel enterprise demand engine across outbound, content, paid and events, with the company's first MQL and SQL definitions and an inside sales pre-qualification layer, creating a 7,000+ lead enterprise pipeline that no longer depended on personal networks.</w:t>
+      </w:r>
+    </w:p>
+    <w:p>
+      <w:pPr>
+        <w:pStyle w:val="ListBullet"/>
+        <w:spacing w:after="20"/>
+      </w:pPr>
+      <w:r>
+        <w:t xml:space="preserve">Designed HubSpot </w:t>
+      </w:r>
+      <w:r>
+        <w:t xml:space="preserve">email </w:t>
+      </w:r>
+      <w:r>
+        <w:t>nurture</w:t>
+      </w:r>
+      <w:r>
+        <w:t xml:space="preserve"> basis</w:t>
+      </w:r>
+      <w:r>
+        <w:t xml:space="preserve"> industry and pain-point segmentation, with jobs-to-be-done behind each sequence and content validated by product and account teams. Email engagement up 25%.</w:t>
+      </w:r>
+    </w:p>
+    <w:p>
+      <w:pPr>
+        <w:pStyle w:val="ListBullet"/>
+        <w:spacing w:after="20"/>
+      </w:pPr>
+      <w:r>
+        <w:lastRenderedPageBreak/>
+        <w:t>Took Retail in a Box, AI.VIS and Wi-Fi Pro to three different buyer types and ran the warehousing and PG verticals end to end; for Wi-Fi Pro, ran a low-cost direct GTM through email, pamphlets and meetings and sold to PG owners in Bangalore personally.</w:t>
+      </w:r>
+    </w:p>
+    <w:p>
+      <w:pPr>
+        <w:pStyle w:val="ListBullet"/>
+      </w:pPr>
+      <w:r>
+        <w:t>Engineered the content strategy and moved the visual language to an enterprise register, driving a 60% increase in engagement and 15% monthly follower growth on LinkedIn.</w:t>
+      </w:r>
+    </w:p>
+    <w:p>
+      <w:pPr>
+        <w:pStyle w:val="ListBullet"/>
+        <w:spacing w:after="20"/>
+      </w:pPr>
+      <w:r>
+        <w:t xml:space="preserve">Delivered Spectra One, an enterprise customer portal stalled for two years, in six months against a board commitment: owned UI and UX, wrote PRDs and journey maps, and ran </w:t>
+      </w:r>
+      <w:r>
+        <w:t xml:space="preserve">multiple </w:t>
+      </w:r>
+      <w:r>
+        <w:t>stakeholder groups</w:t>
+      </w:r>
+      <w:r>
+        <w:t xml:space="preserve"> - </w:t>
+      </w:r>
+      <w:r>
+        <w:t>Business Excellence, CRM, Customer Experience, Product, IT and operations</w:t>
+      </w:r>
+      <w:r>
+        <w:t xml:space="preserve"> </w:t>
+      </w:r>
+      <w:r>
+        <w:t xml:space="preserve">to ensure </w:t>
+      </w:r>
+      <w:r>
+        <w:t xml:space="preserve">fast </w:t>
+      </w:r>
+      <w:r>
+        <w:t xml:space="preserve">co-ordination and launch. </w:t>
+      </w:r>
+    </w:p>
+    <w:p>
+      <w:pPr>
+        <w:keepNext/>
         <w:tabs>
           <w:tab w:val="right" w:pos="10469"/>
         </w:tabs>
-        <w:spacing w:before="56" w:after="14"/>
+        <w:spacing w:before="80" w:after="0"/>
+      </w:pPr>
+      <w:r>
         <w:rPr>
-          <w:rFonts w:ascii="Times New Roman" w:hAnsi="Times New Roman" w:cs="Times New Roman"/>
+          <w:b/>
+          <w:color w:val="1F3A5F"/>
           <w:sz w:val="20"/>
-          <w:szCs w:val="20"/>
         </w:rPr>
-      </w:pPr>
+        <w:t xml:space="preserve">Senior Manager, </w:t>
+      </w:r>
       <w:r>
         <w:rPr>
-          <w:rFonts w:ascii="Times New Roman" w:hAnsi="Times New Roman" w:cs="Times New Roman"/>
           <w:b/>
-          <w:i/>
+          <w:color w:val="1F3A5F"/>
           <w:sz w:val="20"/>
-          <w:szCs w:val="20"/>
         </w:rPr>
-        <w:t>Senior Manager, Marketing</w:t>
+        <w:t>Marketing</w:t>
       </w:r>
       <w:r>
         <w:rPr>
-          <w:rFonts w:ascii="Times New Roman" w:hAnsi="Times New Roman" w:cs="Times New Roman"/>
+          <w:color w:val="555F6B"/>
+          <w:sz w:val="20"/>
+        </w:rPr>
+        <w:t xml:space="preserve"> </w:t>
+      </w:r>
+      <w:proofErr w:type="gramStart"/>
+      <w:r>
+        <w:rPr>
+          <w:color w:val="555F6B"/>
+          <w:sz w:val="20"/>
+        </w:rPr>
+        <w:t>|</w:t>
+      </w:r>
+      <w:r>
+        <w:rPr>
+          <w:color w:val="555F6B"/>
+          <w:sz w:val="20"/>
+        </w:rPr>
+        <w:t xml:space="preserve">  </w:t>
+      </w:r>
+      <w:proofErr w:type="spellStart"/>
+      <w:r>
+        <w:rPr>
           <w:b/>
-          <w:i/>
           <w:sz w:val="20"/>
-          <w:szCs w:val="20"/>
+        </w:rPr>
+        <w:t>Complinity</w:t>
+      </w:r>
+      <w:proofErr w:type="spellEnd"/>
+      <w:proofErr w:type="gramEnd"/>
+      <w:r>
+        <w:rPr>
+          <w:b/>
+          <w:sz w:val="20"/>
+        </w:rPr>
+        <w:t xml:space="preserve"> Technologies</w:t>
+      </w:r>
+      <w:r>
+        <w:rPr>
+          <w:sz w:val="20"/>
+        </w:rPr>
+        <w:t>, Gurugram</w:t>
+      </w:r>
+      <w:r>
+        <w:rPr>
+          <w:b/>
+          <w:color w:val="555F6B"/>
+          <w:sz w:val="19"/>
         </w:rPr>
         <w:tab/>
-        <w:t>May 2022 – Sep 2024</w:t>
+        <w:t>Nov 2021 – May 2022</w:t>
       </w:r>
     </w:p>
     <w:p>
       <w:pPr>
+        <w:keepNext/>
+        <w:spacing w:after="20"/>
+      </w:pPr>
+      <w:r>
+        <w:rPr>
+          <w:i/>
+          <w:color w:val="555F6B"/>
+        </w:rPr>
+        <w:t>Governance, risk and compliance SaaS platform.</w:t>
+      </w:r>
+    </w:p>
+    <w:p>
+      <w:pPr>
+        <w:pStyle w:val="ListBullet"/>
+      </w:pPr>
+      <w:r>
+        <w:t xml:space="preserve">Built the full marketing function solo in six months, with one messaging framework across </w:t>
+      </w:r>
+      <w:r>
+        <w:t>website</w:t>
+      </w:r>
+      <w:r>
+        <w:t>,</w:t>
+      </w:r>
+      <w:r>
+        <w:t xml:space="preserve"> content and social strategy, email, SEO, paid search and display, webinars, events and podcasts</w:t>
+      </w:r>
+      <w:r>
+        <w:t xml:space="preserve">. </w:t>
+      </w:r>
+      <w:r>
+        <w:t>Leads up 40%, conversion up 25%.</w:t>
+      </w:r>
+    </w:p>
+    <w:p>
+      <w:pPr>
+        <w:pStyle w:val="ListBullet"/>
+        <w:spacing w:after="20"/>
+      </w:pPr>
+      <w:proofErr w:type="spellStart"/>
+      <w:r>
+        <w:t>Optimised</w:t>
+      </w:r>
+      <w:proofErr w:type="spellEnd"/>
+      <w:r>
+        <w:t xml:space="preserve"> spend from multiple channels to the two that won on relevance: segmented email, which became a primary lead source and</w:t>
+      </w:r>
+      <w:r>
+        <w:t xml:space="preserve"> </w:t>
+      </w:r>
+      <w:r>
+        <w:t xml:space="preserve">established a </w:t>
+      </w:r>
+      <w:r>
+        <w:t>monthly regulatory webinar series that outperformed paid campaigns.</w:t>
+      </w:r>
+    </w:p>
+    <w:p>
+      <w:pPr>
         <w:pStyle w:val="ListBullet"/>
         <w:rPr>
-          <w:rFonts w:ascii="Times New Roman" w:hAnsi="Times New Roman" w:cs="Times New Roman"/>
-          <w:sz w:val="20"/>
-          <w:szCs w:val="20"/>
+          <w:lang w:val="en-IN" w:eastAsia="en-GB"/>
         </w:rPr>
       </w:pPr>
       <w:r>
         <w:rPr>
-          <w:rFonts w:ascii="Times New Roman" w:hAnsi="Times New Roman" w:cs="Times New Roman"/>
-          <w:sz w:val="20"/>
-          <w:szCs w:val="20"/>
+          <w:lang w:val="en-IN" w:eastAsia="en-GB"/>
         </w:rPr>
-        <w:t>Orchestrated the pivot from B2C to B2B, increasing brand visibility by 35% through integrated PR, social media and events.</w:t>
+        <w:t>R</w:t>
+      </w:r>
+      <w:r>
+        <w:rPr>
+          <w:lang w:val="en-IN" w:eastAsia="en-GB"/>
+        </w:rPr>
+        <w:t>ebuilt the website, refocusing SEO and paid search on buyer intent to triple leads from 10 to 30/month.</w:t>
       </w:r>
     </w:p>
     <w:p>
       <w:pPr>
         <w:pStyle w:val="ListBullet"/>
-        <w:rPr>
-          <w:rFonts w:ascii="Times New Roman" w:hAnsi="Times New Roman" w:cs="Times New Roman"/>
-          <w:sz w:val="20"/>
-          <w:szCs w:val="20"/>
-        </w:rPr>
-      </w:pPr>
-      <w:r>
-        <w:rPr>
-          <w:rFonts w:ascii="Times New Roman" w:hAnsi="Times New Roman" w:cs="Times New Roman"/>
-          <w:sz w:val="20"/>
-          <w:szCs w:val="20"/>
-        </w:rPr>
-        <w:t>Led demand generation that boosted lead generation by 45% and sales conversions by 20%, managing a pipeline of 7,000+ leads.</w:t>
+        <w:spacing w:after="20"/>
+      </w:pPr>
+      <w:r>
+        <w:t xml:space="preserve">Established key marketplace partnerships (Capterra, Software Advice, </w:t>
+      </w:r>
+      <w:proofErr w:type="spellStart"/>
+      <w:r>
+        <w:t>SoftwareSuggest</w:t>
+      </w:r>
+      <w:proofErr w:type="spellEnd"/>
+      <w:r>
+        <w:t>), contributing to a 30% growth in partnership-driven revenue.</w:t>
       </w:r>
     </w:p>
     <w:p>
       <w:pPr>
-        <w:pStyle w:val="ListBullet"/>
-        <w:rPr>
-          <w:rFonts w:ascii="Times New Roman" w:hAnsi="Times New Roman" w:cs="Times New Roman"/>
-          <w:sz w:val="20"/>
-          <w:szCs w:val="20"/>
-        </w:rPr>
-      </w:pPr>
-      <w:r>
-        <w:rPr>
-          <w:rFonts w:ascii="Times New Roman" w:hAnsi="Times New Roman" w:cs="Times New Roman"/>
-          <w:sz w:val="20"/>
-          <w:szCs w:val="20"/>
-        </w:rPr>
-        <w:t>Launched three flagship products, enhancing customer experience and retention by 40% with significant digital engagement.</w:t>
-      </w:r>
-    </w:p>
-    <w:p>
-      <w:pPr>
-        <w:pStyle w:val="ListBullet"/>
-        <w:rPr>
-          <w:rFonts w:ascii="Times New Roman" w:hAnsi="Times New Roman" w:cs="Times New Roman"/>
-          <w:sz w:val="20"/>
-          <w:szCs w:val="20"/>
-        </w:rPr>
-      </w:pPr>
-      <w:r>
-        <w:rPr>
-          <w:rFonts w:ascii="Times New Roman" w:hAnsi="Times New Roman" w:cs="Times New Roman"/>
-          <w:sz w:val="20"/>
-          <w:szCs w:val="20"/>
-        </w:rPr>
-        <w:t>Designed an automated marketing workflow using HubSpot, streamlining email campaigns and improving engagement rates by 25%.</w:t>
-      </w:r>
-    </w:p>
-    <w:p>
-      <w:pPr>
-        <w:pStyle w:val="ListBullet"/>
-        <w:rPr>
-          <w:rFonts w:ascii="Times New Roman" w:hAnsi="Times New Roman" w:cs="Times New Roman"/>
-          <w:sz w:val="20"/>
-          <w:szCs w:val="20"/>
-        </w:rPr>
-      </w:pPr>
-      <w:r>
-        <w:rPr>
-          <w:rFonts w:ascii="Times New Roman" w:hAnsi="Times New Roman" w:cs="Times New Roman"/>
-          <w:sz w:val="20"/>
-          <w:szCs w:val="20"/>
-        </w:rPr>
-        <w:t>Engineered the content strategy, driving a 60% increase in engagement and 15% monthly LinkedIn follower growth, and ran a fortnightly strategy cadence across 10+ stakeholders that elevated project success rates by 30% in a quarter.</w:t>
-      </w:r>
-    </w:p>
-    <w:p>
-      <w:pPr>
-        <w:spacing w:before="84"/>
-        <w:rPr>
-          <w:rFonts w:ascii="Times New Roman" w:hAnsi="Times New Roman" w:cs="Times New Roman"/>
-          <w:sz w:val="20"/>
-          <w:szCs w:val="20"/>
-        </w:rPr>
-      </w:pPr>
-      <w:r>
-        <w:rPr>
-          <w:rFonts w:ascii="Times New Roman" w:hAnsi="Times New Roman" w:cs="Times New Roman"/>
-          <w:b/>
-          <w:sz w:val="20"/>
-          <w:szCs w:val="20"/>
-        </w:rPr>
-        <w:t>Complinity Technologies</w:t>
-      </w:r>
-    </w:p>
-    <w:p>
-      <w:pPr>
+        <w:keepNext/>
         <w:tabs>
           <w:tab w:val="right" w:pos="10469"/>
         </w:tabs>
-        <w:spacing w:before="56" w:after="14"/>
+        <w:spacing w:before="80" w:after="0"/>
+      </w:pPr>
+      <w:r>
         <w:rPr>
-          <w:rFonts w:ascii="Times New Roman" w:hAnsi="Times New Roman" w:cs="Times New Roman"/>
+          <w:b/>
+          <w:color w:val="1F3A5F"/>
           <w:sz w:val="20"/>
-          <w:szCs w:val="20"/>
         </w:rPr>
-      </w:pPr>
+        <w:t xml:space="preserve">Assistant Manager, </w:t>
+      </w:r>
       <w:r>
         <w:rPr>
-          <w:rFonts w:ascii="Times New Roman" w:hAnsi="Times New Roman" w:cs="Times New Roman"/>
           <w:b/>
-          <w:i/>
+          <w:color w:val="1F3A5F"/>
           <w:sz w:val="20"/>
-          <w:szCs w:val="20"/>
         </w:rPr>
-        <w:t>Senior Manager, Marketing</w:t>
+        <w:t>Marketing</w:t>
       </w:r>
       <w:r>
         <w:rPr>
-          <w:rFonts w:ascii="Times New Roman" w:hAnsi="Times New Roman" w:cs="Times New Roman"/>
+          <w:color w:val="555F6B"/>
+          <w:sz w:val="20"/>
+        </w:rPr>
+        <w:t xml:space="preserve"> </w:t>
+      </w:r>
+      <w:r>
+        <w:rPr>
+          <w:color w:val="555F6B"/>
+          <w:sz w:val="20"/>
+        </w:rPr>
+        <w:t xml:space="preserve">| </w:t>
+      </w:r>
+      <w:r>
+        <w:rPr>
           <w:b/>
-          <w:i/>
+          <w:bCs/>
+          <w:color w:val="000000" w:themeColor="text1"/>
           <w:sz w:val="20"/>
-          <w:szCs w:val="20"/>
+        </w:rPr>
+        <w:t>AgreeYa</w:t>
+      </w:r>
+      <w:r>
+        <w:rPr>
+          <w:b/>
+          <w:bCs/>
+          <w:color w:val="000000" w:themeColor="text1"/>
+          <w:sz w:val="20"/>
+        </w:rPr>
+        <w:t xml:space="preserve"> Solutions</w:t>
+      </w:r>
+      <w:r>
+        <w:rPr>
+          <w:sz w:val="20"/>
+        </w:rPr>
+        <w:t>, Noida</w:t>
+      </w:r>
+      <w:r>
+        <w:rPr>
+          <w:b/>
+          <w:color w:val="555F6B"/>
+          <w:sz w:val="19"/>
         </w:rPr>
         <w:tab/>
-        <w:t>Nov 2021 – May 2022</w:t>
+        <w:t>Sep 2016 – Oct 2021</w:t>
       </w:r>
     </w:p>
     <w:p>
       <w:pPr>
-        <w:pStyle w:val="ListBullet"/>
+        <w:keepNext/>
+        <w:spacing w:after="20"/>
+      </w:pPr>
+      <w:r>
         <w:rPr>
-          <w:rFonts w:ascii="Times New Roman" w:hAnsi="Times New Roman" w:cs="Times New Roman"/>
-          <w:sz w:val="20"/>
-          <w:szCs w:val="20"/>
+          <w:i/>
+          <w:color w:val="555F6B"/>
         </w:rPr>
-      </w:pPr>
-      <w:r>
-        <w:rPr>
-          <w:rFonts w:ascii="Times New Roman" w:hAnsi="Times New Roman" w:cs="Times New Roman"/>
-          <w:sz w:val="20"/>
-          <w:szCs w:val="20"/>
-        </w:rPr>
-        <w:t>Implemented digital marketing across Google and Bing Ads, Google Display and SEO for a 40% increase in leads and a 25% rise in conversion rates, and enhanced brand visibility by 30% through website redesign, webinars, display advertising and podcasts.</w:t>
+        <w:t>Enterprise IT services and software company serving the US market.</w:t>
       </w:r>
     </w:p>
     <w:p>
       <w:pPr>
         <w:pStyle w:val="ListBullet"/>
-        <w:rPr>
-          <w:rFonts w:ascii="Times New Roman" w:hAnsi="Times New Roman" w:cs="Times New Roman"/>
-          <w:sz w:val="20"/>
-          <w:szCs w:val="20"/>
-        </w:rPr>
-      </w:pPr>
-      <w:r>
-        <w:rPr>
-          <w:rFonts w:ascii="Times New Roman" w:hAnsi="Times New Roman" w:cs="Times New Roman"/>
-          <w:sz w:val="20"/>
-          <w:szCs w:val="20"/>
-        </w:rPr>
-        <w:t>Devised the content and social strategy, elevating engagement by 70% and community growth by 40%, and rebuilt email on automation and segmentation, improving engagement by 80% and conversion by 40%.</w:t>
+        <w:spacing w:after="20"/>
+      </w:pPr>
+      <w:r>
+        <w:t>Won a $250K budget at a company that had never funded marketing at that level, with a plan worked back from a $2.5M revenue target. Delivered ~$1M in marketing-influenced revenue and 1,000+ qualified leads within nine months.</w:t>
       </w:r>
     </w:p>
     <w:p>
       <w:pPr>
         <w:pStyle w:val="ListBullet"/>
-        <w:rPr>
-          <w:rFonts w:ascii="Times New Roman" w:hAnsi="Times New Roman" w:cs="Times New Roman"/>
-          <w:sz w:val="20"/>
-          <w:szCs w:val="20"/>
-        </w:rPr>
-      </w:pPr>
-      <w:r>
-        <w:rPr>
-          <w:rFonts w:ascii="Times New Roman" w:hAnsi="Times New Roman" w:cs="Times New Roman"/>
-          <w:sz w:val="20"/>
-          <w:szCs w:val="20"/>
-        </w:rPr>
-        <w:t xml:space="preserve">Established partnerships with Capterra, Software Suggest and Software Advice contributing 30% growth in partnership-driven </w:t>
-      </w:r>
-      <w:proofErr w:type="gramStart"/>
-      <w:r>
-        <w:rPr>
-          <w:rFonts w:ascii="Times New Roman" w:hAnsi="Times New Roman" w:cs="Times New Roman"/>
-          <w:sz w:val="20"/>
-          <w:szCs w:val="20"/>
-        </w:rPr>
-        <w:t>revenue, and</w:t>
-      </w:r>
-      <w:proofErr w:type="gramEnd"/>
-      <w:r>
-        <w:rPr>
-          <w:rFonts w:ascii="Times New Roman" w:hAnsi="Times New Roman" w:cs="Times New Roman"/>
-          <w:sz w:val="20"/>
-          <w:szCs w:val="20"/>
-        </w:rPr>
-        <w:t xml:space="preserve"> aligned marketing with sales to achieve 25% market share growth and a 30% increase in profitability.</w:t>
+        <w:spacing w:after="20"/>
+      </w:pPr>
+      <w:r>
+        <w:t xml:space="preserve">Built digital from zero in an events-led business, winning investment with projection models: SEO, website and CRO, content, email nurture, paid search and paid social. 10,000+ unique visitors in the </w:t>
+      </w:r>
+      <w:r>
+        <w:t>first year</w:t>
+      </w:r>
+      <w:r>
+        <w:t>, user engagement up 35%.</w:t>
       </w:r>
     </w:p>
     <w:p>
       <w:pPr>
-        <w:spacing w:before="84"/>
-        <w:rPr>
-          <w:rFonts w:ascii="Times New Roman" w:hAnsi="Times New Roman" w:cs="Times New Roman"/>
-          <w:sz w:val="20"/>
-          <w:szCs w:val="20"/>
-        </w:rPr>
-      </w:pPr>
-      <w:r>
-        <w:rPr>
-          <w:rFonts w:ascii="Times New Roman" w:hAnsi="Times New Roman" w:cs="Times New Roman"/>
-          <w:b/>
-          <w:sz w:val="20"/>
-          <w:szCs w:val="20"/>
-        </w:rPr>
-        <w:t>AgreeYa Solutions</w:t>
+        <w:pStyle w:val="ListBullet"/>
+        <w:spacing w:after="20"/>
+      </w:pPr>
+      <w:r>
+        <w:t xml:space="preserve">Ran multi-channel acquisition for </w:t>
+      </w:r>
+      <w:proofErr w:type="spellStart"/>
+      <w:r>
+        <w:t>QuickApps</w:t>
+      </w:r>
+      <w:proofErr w:type="spellEnd"/>
+      <w:r>
+        <w:t xml:space="preserve"> and </w:t>
+      </w:r>
+      <w:proofErr w:type="spellStart"/>
+      <w:r>
+        <w:t>BeatBlip</w:t>
+      </w:r>
+      <w:proofErr w:type="spellEnd"/>
+      <w:r>
+        <w:t xml:space="preserve"> across Google and Bing Ads, LinkedIn, email, partner webinars and conferences, and replaced declining email with a</w:t>
+      </w:r>
+      <w:r>
+        <w:t xml:space="preserve"> content </w:t>
+      </w:r>
+      <w:r>
+        <w:t>syndication channel that scaled from a 100-lead pilot to 500 leads a year. Lead quality up 50%, conversion up 30%.</w:t>
       </w:r>
     </w:p>
     <w:p>
       <w:pPr>
+        <w:pStyle w:val="ListBullet"/>
+        <w:spacing w:after="20"/>
+      </w:pPr>
+      <w:r>
+        <w:t>Defined Lead, MQL, SQL, Opportunity and Win jointly with sales, signed off by sales and the CEO, and built the attribution framework that exposed funnel leaks. Lead conversion up 25%.</w:t>
+      </w:r>
+    </w:p>
+    <w:p>
+      <w:pPr>
+        <w:pStyle w:val="ListBullet"/>
+        <w:spacing w:after="20"/>
+      </w:pPr>
+      <w:r>
+        <w:t xml:space="preserve">Repositioned </w:t>
+      </w:r>
+      <w:proofErr w:type="spellStart"/>
+      <w:r>
+        <w:t>QuickApps</w:t>
+      </w:r>
+      <w:proofErr w:type="spellEnd"/>
+      <w:r>
+        <w:t xml:space="preserve"> from a Dell-branded product to an AgreeYa proposition, with separate ICPs, personas and messaging per product. Customer engagement up 25%.</w:t>
+      </w:r>
+    </w:p>
+    <w:p>
+      <w:pPr>
+        <w:pStyle w:val="ListBullet"/>
+        <w:spacing w:after="20"/>
+      </w:pPr>
+      <w:r>
+        <w:t>Took Microsoft Ignite from attendance to sponsorship through the Microsoft Partner Network. One $40K event returned 700+ leads at $57 each against a 300-lead forecast, 40+ target-account meetings and roughly half the period's lead target in a single week.</w:t>
+      </w:r>
+    </w:p>
+    <w:p>
+      <w:pPr>
+        <w:pStyle w:val="ListBullet"/>
+        <w:spacing w:after="20"/>
+      </w:pPr>
+      <w:r>
+        <w:t>Turned an India employer brand award into a credibility asset for US buyers across web, social, PR, events and email.</w:t>
+      </w:r>
+    </w:p>
+    <w:p>
+      <w:pPr>
+        <w:keepNext/>
         <w:tabs>
           <w:tab w:val="right" w:pos="10469"/>
         </w:tabs>
-        <w:spacing w:before="56" w:after="14"/>
+        <w:spacing w:before="80" w:after="20"/>
+      </w:pPr>
+      <w:r>
         <w:rPr>
-          <w:rFonts w:ascii="Times New Roman" w:hAnsi="Times New Roman" w:cs="Times New Roman"/>
+          <w:b/>
+          <w:color w:val="1F3A5F"/>
           <w:sz w:val="20"/>
-          <w:szCs w:val="20"/>
         </w:rPr>
-      </w:pPr>
+        <w:t xml:space="preserve">Manager, Sales and </w:t>
+      </w:r>
       <w:r>
         <w:rPr>
-          <w:rFonts w:ascii="Times New Roman" w:hAnsi="Times New Roman" w:cs="Times New Roman"/>
           <w:b/>
-          <w:i/>
+          <w:color w:val="1F3A5F"/>
           <w:sz w:val="20"/>
-          <w:szCs w:val="20"/>
         </w:rPr>
-        <w:t>Assistant Manager, Marketing</w:t>
+        <w:t>Marketing</w:t>
       </w:r>
       <w:r>
         <w:rPr>
-          <w:rFonts w:ascii="Times New Roman" w:hAnsi="Times New Roman" w:cs="Times New Roman"/>
+          <w:color w:val="555F6B"/>
+          <w:sz w:val="20"/>
+        </w:rPr>
+        <w:t xml:space="preserve"> </w:t>
+      </w:r>
+      <w:proofErr w:type="gramStart"/>
+      <w:r>
+        <w:rPr>
+          <w:color w:val="555F6B"/>
+          <w:sz w:val="20"/>
+        </w:rPr>
+        <w:t>|</w:t>
+      </w:r>
+      <w:r>
+        <w:rPr>
+          <w:color w:val="555F6B"/>
+          <w:sz w:val="20"/>
+        </w:rPr>
+        <w:t xml:space="preserve">  </w:t>
+      </w:r>
+      <w:r>
+        <w:rPr>
           <w:b/>
-          <w:i/>
           <w:sz w:val="20"/>
-          <w:szCs w:val="20"/>
+        </w:rPr>
+        <w:t>Systems</w:t>
+      </w:r>
+      <w:proofErr w:type="gramEnd"/>
+      <w:r>
+        <w:rPr>
+          <w:b/>
+          <w:sz w:val="20"/>
+        </w:rPr>
+        <w:t xml:space="preserve"> Lifecycle</w:t>
+      </w:r>
+      <w:r>
+        <w:rPr>
+          <w:b/>
+          <w:sz w:val="20"/>
+        </w:rPr>
+        <w:t>, Gurugram</w:t>
+      </w:r>
+      <w:r>
+        <w:rPr>
+          <w:b/>
+          <w:color w:val="555F6B"/>
+          <w:sz w:val="19"/>
         </w:rPr>
         <w:tab/>
-        <w:t>Sep 2016 – Oct 2021</w:t>
+        <w:t>Jan 2015 – Sep 2016</w:t>
       </w:r>
     </w:p>
     <w:p>
       <w:pPr>
+        <w:keepNext/>
+        <w:spacing w:after="20"/>
+      </w:pPr>
+      <w:r>
+        <w:rPr>
+          <w:i/>
+          <w:color w:val="555F6B"/>
+        </w:rPr>
+        <w:t>Software company with a compliance management product.</w:t>
+      </w:r>
+    </w:p>
+    <w:p>
+      <w:pPr>
         <w:pStyle w:val="ListBullet"/>
         <w:rPr>
-          <w:rFonts w:ascii="Times New Roman" w:hAnsi="Times New Roman" w:cs="Times New Roman"/>
-          <w:sz w:val="20"/>
-          <w:szCs w:val="20"/>
+          <w:lang w:val="en-IN" w:eastAsia="en-GB"/>
         </w:rPr>
       </w:pPr>
+      <w:bookmarkStart w:id="1" w:name="OLE_LINK7"/>
       <w:r>
         <w:rPr>
-          <w:rFonts w:ascii="Times New Roman" w:hAnsi="Times New Roman" w:cs="Times New Roman"/>
-          <w:sz w:val="20"/>
-          <w:szCs w:val="20"/>
+          <w:lang w:val="en-IN" w:eastAsia="en-GB"/>
         </w:rPr>
-        <w:t>Led a GTM strategy with targeted messaging and channel selection, delivering a 25% increase in customer engagement.</w:t>
+        <w:t xml:space="preserve">Ran </w:t>
+      </w:r>
+      <w:r>
+        <w:rPr>
+          <w:lang w:val="en-IN" w:eastAsia="en-GB"/>
+        </w:rPr>
+        <w:t>end-to-end sales and marketing from demand generation to account management, increasing leads 80%, doubling lead-to-conversion from 10% to 20%, and contributing to 25% annual revenue growth.</w:t>
       </w:r>
     </w:p>
     <w:p>
       <w:pPr>
         <w:pStyle w:val="ListBullet"/>
         <w:rPr>
-          <w:rFonts w:ascii="Times New Roman" w:hAnsi="Times New Roman" w:cs="Times New Roman"/>
-          <w:sz w:val="20"/>
-          <w:szCs w:val="20"/>
+          <w:lang w:val="en-IN" w:eastAsia="en-GB"/>
         </w:rPr>
       </w:pPr>
       <w:r>
         <w:rPr>
-          <w:rFonts w:ascii="Times New Roman" w:hAnsi="Times New Roman" w:cs="Times New Roman"/>
-          <w:sz w:val="20"/>
-          <w:szCs w:val="20"/>
+          <w:lang w:val="en-IN" w:eastAsia="en-GB"/>
         </w:rPr>
-        <w:t>Steered integrated brand campaigns across ATL, BTL, digital and social media, including major events such as Microsoft Ignite, delivering a 25% boost in brand awareness within six months.</w:t>
+        <w:t>Built the digital acquisition engine across SEO, PPC, Google Ads, LinkedIn, email and social, improving campaign ROI 40% and reducing CPA 30% through data-led optimisation.</w:t>
       </w:r>
     </w:p>
     <w:p>
       <w:pPr>
         <w:pStyle w:val="ListBullet"/>
         <w:rPr>
-          <w:rFonts w:ascii="Times New Roman" w:hAnsi="Times New Roman" w:cs="Times New Roman"/>
-          <w:sz w:val="20"/>
-          <w:szCs w:val="20"/>
+          <w:lang w:val="en-IN" w:eastAsia="en-GB"/>
         </w:rPr>
       </w:pPr>
       <w:r>
         <w:rPr>
-          <w:rFonts w:ascii="Times New Roman" w:hAnsi="Times New Roman" w:cs="Times New Roman"/>
-          <w:sz w:val="20"/>
-          <w:szCs w:val="20"/>
+          <w:lang w:val="en-IN" w:eastAsia="en-GB"/>
         </w:rPr>
-        <w:t>Directed multi-channel demand generation across Google and Bing Ads, email and SEO, improving lead quality by 50% and conversion rates by 30%, amounting to over 1,000 qualified leads per quarter.</w:t>
+        <w:t>Launched the first Google Ads programme and secured LinkedIn investment through a projections-led business case, delivering one lead per day and 30% follower growth.</w:t>
       </w:r>
     </w:p>
     <w:p>
       <w:pPr>
         <w:pStyle w:val="ListBullet"/>
         <w:rPr>
-          <w:rFonts w:ascii="Times New Roman" w:hAnsi="Times New Roman" w:cs="Times New Roman"/>
-          <w:sz w:val="20"/>
-          <w:szCs w:val="20"/>
+          <w:lang w:val="en-IN" w:eastAsia="en-GB"/>
         </w:rPr>
       </w:pPr>
       <w:r>
         <w:rPr>
-          <w:rFonts w:ascii="Times New Roman" w:hAnsi="Times New Roman" w:cs="Times New Roman"/>
-          <w:sz w:val="20"/>
-          <w:szCs w:val="20"/>
+          <w:lang w:val="en-IN" w:eastAsia="en-GB"/>
         </w:rPr>
-        <w:t xml:space="preserve">Initiated campaigns that drove a 35% increase in user engagement and over 10,000 unique visitors in the first </w:t>
-      </w:r>
-      <w:proofErr w:type="gramStart"/>
-      <w:r>
-        <w:rPr>
-          <w:rFonts w:ascii="Times New Roman" w:hAnsi="Times New Roman" w:cs="Times New Roman"/>
-          <w:sz w:val="20"/>
-          <w:szCs w:val="20"/>
-        </w:rPr>
-        <w:t>quarter, and</w:t>
-      </w:r>
-      <w:proofErr w:type="gramEnd"/>
-      <w:r>
-        <w:rPr>
-          <w:rFonts w:ascii="Times New Roman" w:hAnsi="Times New Roman" w:cs="Times New Roman"/>
-          <w:sz w:val="20"/>
-          <w:szCs w:val="20"/>
-        </w:rPr>
-        <w:t xml:space="preserve"> implemented an analytics framework that increased lead conversion by 25% by identifying key gaps in the acquisition funnel.</w:t>
+        <w:t>Shifted from price competition to a referral-led partnership model with legal and professional-services firms, creating a reciprocal acquisition channel with trusted advisers.</w:t>
       </w:r>
     </w:p>
     <w:p>
       <w:pPr>
-        <w:spacing w:before="84"/>
+        <w:pStyle w:val="ListBullet"/>
+        <w:numPr>
+          <w:ilvl w:val="0"/>
+          <w:numId w:val="0"/>
+        </w:numPr>
+        <w:spacing w:after="20"/>
+      </w:pPr>
+    </w:p>
+    <w:bookmarkEnd w:id="1"/>
+    <w:p>
+      <w:pPr>
+        <w:keepNext/>
+        <w:spacing w:before="80" w:after="10"/>
         <w:rPr>
-          <w:rFonts w:ascii="Times New Roman" w:hAnsi="Times New Roman" w:cs="Times New Roman"/>
+          <w:color w:val="000000" w:themeColor="text1"/>
+        </w:rPr>
+      </w:pPr>
+      <w:r>
+        <w:rPr>
+          <w:b/>
+          <w:color w:val="000000" w:themeColor="text1"/>
           <w:sz w:val="20"/>
-          <w:szCs w:val="20"/>
         </w:rPr>
-      </w:pPr>
-      <w:r>
-        <w:rPr>
-          <w:rFonts w:ascii="Times New Roman" w:hAnsi="Times New Roman" w:cs="Times New Roman"/>
-          <w:b/>
-          <w:sz w:val="20"/>
-          <w:szCs w:val="20"/>
-        </w:rPr>
-        <w:t>Systems Lifecycle Private Limited</w:t>
+        <w:t>Earlier Career</w:t>
       </w:r>
     </w:p>
     <w:p>
       <w:pPr>
+        <w:keepNext/>
         <w:tabs>
           <w:tab w:val="right" w:pos="10469"/>
         </w:tabs>
-        <w:spacing w:before="56" w:after="14"/>
+        <w:spacing w:after="0"/>
+      </w:pPr>
+      <w:r>
         <w:rPr>
-          <w:rFonts w:ascii="Times New Roman" w:hAnsi="Times New Roman" w:cs="Times New Roman"/>
-          <w:sz w:val="20"/>
-          <w:szCs w:val="20"/>
+          <w:b/>
+          <w:color w:val="1F3A5F"/>
         </w:rPr>
-      </w:pPr>
+        <w:t xml:space="preserve">Assistant Manager, Sales and </w:t>
+      </w:r>
       <w:r>
         <w:rPr>
-          <w:rFonts w:ascii="Times New Roman" w:hAnsi="Times New Roman" w:cs="Times New Roman"/>
           <w:b/>
-          <w:i/>
-          <w:sz w:val="20"/>
-          <w:szCs w:val="20"/>
+          <w:color w:val="1F3A5F"/>
         </w:rPr>
-        <w:t>Manager, Sales and Marketing</w:t>
+        <w:t>Marketing</w:t>
+      </w:r>
+      <w:r>
+        <w:t xml:space="preserve"> </w:t>
+      </w:r>
+      <w:r>
+        <w:t>| WMS</w:t>
       </w:r>
       <w:r>
         <w:rPr>
-          <w:rFonts w:ascii="Times New Roman" w:hAnsi="Times New Roman" w:cs="Times New Roman"/>
           <w:b/>
-          <w:i/>
-          <w:sz w:val="20"/>
-          <w:szCs w:val="20"/>
+          <w:bCs/>
+        </w:rPr>
+        <w:t xml:space="preserve"> Software</w:t>
+      </w:r>
+      <w:r>
+        <w:rPr>
+          <w:b/>
+          <w:bCs/>
+        </w:rPr>
+        <w:t xml:space="preserve">, Noida </w:t>
+      </w:r>
+      <w:r>
+        <w:rPr>
+          <w:b/>
+          <w:color w:val="555F6B"/>
         </w:rPr>
         <w:tab/>
-        <w:t>Jan 2015 – Sep 2016</w:t>
+        <w:t>Dec 2013 – Dec 2014</w:t>
       </w:r>
     </w:p>
     <w:p>
       <w:pPr>
         <w:pStyle w:val="ListBullet"/>
-        <w:rPr>
-          <w:rFonts w:ascii="Times New Roman" w:hAnsi="Times New Roman" w:cs="Times New Roman"/>
-          <w:sz w:val="20"/>
-          <w:szCs w:val="20"/>
-        </w:rPr>
-      </w:pPr>
-      <w:r>
-        <w:rPr>
-          <w:rFonts w:ascii="Times New Roman" w:hAnsi="Times New Roman" w:cs="Times New Roman"/>
-          <w:sz w:val="20"/>
-          <w:szCs w:val="20"/>
-        </w:rPr>
-        <w:t>Oversaw all sales and marketing activity, increasing lead count by 80% and doubling lead-to-conversion from 10% to 20%, contributing to a 40% rise in revenue and a 25% increase in annual revenue.</w:t>
+        <w:spacing w:after="20"/>
+      </w:pPr>
+      <w:r>
+        <w:t>Corporate communications and channel development. Sales up 25%.</w:t>
       </w:r>
     </w:p>
     <w:p>
       <w:pPr>
-        <w:pStyle w:val="ListBullet"/>
-        <w:rPr>
-          <w:rFonts w:ascii="Times New Roman" w:hAnsi="Times New Roman" w:cs="Times New Roman"/>
-          <w:sz w:val="20"/>
-          <w:szCs w:val="20"/>
-        </w:rPr>
-      </w:pPr>
-      <w:r>
-        <w:rPr>
-          <w:rFonts w:ascii="Times New Roman" w:hAnsi="Times New Roman" w:cs="Times New Roman"/>
-          <w:sz w:val="20"/>
-          <w:szCs w:val="20"/>
-        </w:rPr>
-        <w:t>Deployed SEO, SEM and PPC, email, social media and growth hacking tactics, improving campaign ROI by 40% and optimising cost per acquisition by 30% through CTR, CPC, CPM and CPA analysis.</w:t>
-      </w:r>
-    </w:p>
-    <w:p>
-      <w:pPr>
-        <w:spacing w:before="84"/>
-        <w:rPr>
-          <w:rFonts w:ascii="Times New Roman" w:hAnsi="Times New Roman" w:cs="Times New Roman"/>
-          <w:sz w:val="20"/>
-          <w:szCs w:val="20"/>
-        </w:rPr>
-      </w:pPr>
-      <w:r>
-        <w:rPr>
-          <w:rFonts w:ascii="Times New Roman" w:hAnsi="Times New Roman" w:cs="Times New Roman"/>
-          <w:b/>
-          <w:sz w:val="20"/>
-          <w:szCs w:val="20"/>
-        </w:rPr>
-        <w:t>Earlier Experience</w:t>
-      </w:r>
-    </w:p>
-    <w:p>
-      <w:pPr>
+        <w:keepNext/>
         <w:tabs>
           <w:tab w:val="right" w:pos="10469"/>
         </w:tabs>
-        <w:spacing w:before="56" w:after="14"/>
+        <w:spacing w:after="0"/>
+      </w:pPr>
+      <w:r>
         <w:rPr>
-          <w:rFonts w:ascii="Times New Roman" w:hAnsi="Times New Roman" w:cs="Times New Roman"/>
-          <w:sz w:val="20"/>
-          <w:szCs w:val="20"/>
+          <w:b/>
+          <w:color w:val="1F3A5F"/>
         </w:rPr>
-      </w:pPr>
+        <w:t xml:space="preserve">Senior Executive, </w:t>
+      </w:r>
       <w:r>
         <w:rPr>
-          <w:rFonts w:ascii="Times New Roman" w:hAnsi="Times New Roman" w:cs="Times New Roman"/>
           <w:b/>
-          <w:i/>
-          <w:sz w:val="20"/>
-          <w:szCs w:val="20"/>
+          <w:color w:val="1F3A5F"/>
         </w:rPr>
-        <w:t>Assistant Manager, Sales and Marketing – WMS Software</w:t>
-      </w:r>
+        <w:t>Marketing</w:t>
+      </w:r>
+      <w:r>
+        <w:t xml:space="preserve"> </w:t>
+      </w:r>
+      <w:proofErr w:type="gramStart"/>
+      <w:r>
+        <w:t>|</w:t>
+      </w:r>
+      <w:r>
+        <w:t xml:space="preserve">  </w:t>
+      </w:r>
+      <w:proofErr w:type="spellStart"/>
       <w:r>
         <w:rPr>
-          <w:rFonts w:ascii="Times New Roman" w:hAnsi="Times New Roman" w:cs="Times New Roman"/>
           <w:b/>
-          <w:i/>
-          <w:sz w:val="20"/>
-          <w:szCs w:val="20"/>
+          <w:bCs/>
+        </w:rPr>
+        <w:t>Safexpress</w:t>
+      </w:r>
+      <w:proofErr w:type="spellEnd"/>
+      <w:proofErr w:type="gramEnd"/>
+      <w:r>
+        <w:rPr>
+          <w:b/>
+          <w:bCs/>
+        </w:rPr>
+        <w:t>, New Delhi</w:t>
+      </w:r>
+      <w:r>
+        <w:rPr>
+          <w:b/>
+          <w:color w:val="555F6B"/>
         </w:rPr>
         <w:tab/>
-        <w:t>Dec 2013 – Dec 2014</w:t>
+        <w:t>Dec 2012 – Dec 2013</w:t>
       </w:r>
     </w:p>
     <w:p>
       <w:pPr>
         <w:pStyle w:val="ListBullet"/>
-        <w:rPr>
-          <w:rFonts w:ascii="Times New Roman" w:hAnsi="Times New Roman" w:cs="Times New Roman"/>
-          <w:sz w:val="20"/>
-          <w:szCs w:val="20"/>
-        </w:rPr>
-      </w:pPr>
-      <w:r>
-        <w:rPr>
-          <w:rFonts w:ascii="Times New Roman" w:hAnsi="Times New Roman" w:cs="Times New Roman"/>
-          <w:sz w:val="20"/>
-          <w:szCs w:val="20"/>
-        </w:rPr>
-        <w:t>Directed corporate communications and expanded sales through channel development, delivering a 15% increase in brand visibility, a 25% rise in sales and a 40% improvement in client retention.</w:t>
+        <w:spacing w:after="20"/>
+      </w:pPr>
+      <w:r>
+        <w:t xml:space="preserve">Advertising, </w:t>
+      </w:r>
+      <w:r>
+        <w:t>content</w:t>
+      </w:r>
+      <w:r>
+        <w:t xml:space="preserve"> and 1</w:t>
+      </w:r>
+      <w:r>
+        <w:t xml:space="preserve">2 </w:t>
+      </w:r>
+      <w:r>
+        <w:t xml:space="preserve">events delivered for launches in four new cities. Customer leads up </w:t>
+      </w:r>
+      <w:r>
+        <w:t>3</w:t>
+      </w:r>
+      <w:r>
+        <w:t>0%.</w:t>
       </w:r>
     </w:p>
     <w:p>
@@ -1156,51 +1626,87 @@
         <w:tabs>
           <w:tab w:val="right" w:pos="10469"/>
         </w:tabs>
-        <w:spacing w:before="56" w:after="14"/>
+        <w:spacing w:after="10"/>
+      </w:pPr>
+      <w:r>
         <w:rPr>
-          <w:rFonts w:ascii="Times New Roman" w:hAnsi="Times New Roman" w:cs="Times New Roman"/>
-          <w:sz w:val="20"/>
-          <w:szCs w:val="20"/>
+          <w:b/>
+          <w:color w:val="1F3A5F"/>
         </w:rPr>
-      </w:pPr>
+        <w:t xml:space="preserve">Process Advisor · New Accounts Analyst · Process </w:t>
+      </w:r>
       <w:r>
         <w:rPr>
-          <w:rFonts w:ascii="Times New Roman" w:hAnsi="Times New Roman" w:cs="Times New Roman"/>
           <w:b/>
-          <w:i/>
-          <w:sz w:val="20"/>
-          <w:szCs w:val="20"/>
+          <w:color w:val="1F3A5F"/>
         </w:rPr>
-        <w:t>Senior Executive, Marketing – Safexpress Private Limited</w:t>
+        <w:t>Associate</w:t>
+      </w:r>
+      <w:r>
+        <w:t xml:space="preserve"> </w:t>
+      </w:r>
+      <w:proofErr w:type="gramStart"/>
+      <w:r>
+        <w:t>|</w:t>
+      </w:r>
+      <w:r>
+        <w:t xml:space="preserve">  </w:t>
       </w:r>
       <w:r>
         <w:rPr>
-          <w:rFonts w:ascii="Times New Roman" w:hAnsi="Times New Roman" w:cs="Times New Roman"/>
           <w:b/>
-          <w:i/>
-          <w:sz w:val="20"/>
-          <w:szCs w:val="20"/>
+          <w:bCs/>
+        </w:rPr>
+        <w:t>Barclays</w:t>
+      </w:r>
+      <w:proofErr w:type="gramEnd"/>
+      <w:r>
+        <w:rPr>
+          <w:b/>
+          <w:bCs/>
+        </w:rPr>
+        <w:t xml:space="preserve"> Shared Services · American Express · Genpact</w:t>
+      </w:r>
+      <w:r>
+        <w:rPr>
+          <w:b/>
+          <w:color w:val="555F6B"/>
         </w:rPr>
         <w:tab/>
-        <w:t>Dec 2012 – Dec 2013</w:t>
+        <w:t>Jun 2006 – Jul 2010</w:t>
       </w:r>
     </w:p>
     <w:p>
       <w:pPr>
-        <w:pStyle w:val="ListBullet"/>
+        <w:keepNext/>
+        <w:pBdr>
+          <w:bottom w:val="single" w:sz="6" w:space="1" w:color="1F3A5F"/>
+        </w:pBdr>
+        <w:spacing w:before="120" w:after="50"/>
         <w:rPr>
-          <w:rFonts w:ascii="Times New Roman" w:hAnsi="Times New Roman" w:cs="Times New Roman"/>
+          <w:b/>
+          <w:color w:val="1F3A5F"/>
+          <w:spacing w:val="20"/>
           <w:sz w:val="20"/>
-          <w:szCs w:val="20"/>
         </w:rPr>
       </w:pPr>
+    </w:p>
+    <w:p>
+      <w:pPr>
+        <w:keepNext/>
+        <w:pBdr>
+          <w:bottom w:val="single" w:sz="6" w:space="1" w:color="1F3A5F"/>
+        </w:pBdr>
+        <w:spacing w:before="120" w:after="50"/>
+      </w:pPr>
       <w:r>
         <w:rPr>
-          <w:rFonts w:ascii="Times New Roman" w:hAnsi="Times New Roman" w:cs="Times New Roman"/>
+          <w:b/>
+          <w:color w:val="1F3A5F"/>
+          <w:spacing w:val="20"/>
           <w:sz w:val="20"/>
-          <w:szCs w:val="20"/>
         </w:rPr>
-        <w:t>Executed ATL advertising contracts, managed BTL events and developed content, delivering a 40% increase in brand awareness, a 50% rise in customer leads and a 35% boost in user engagement.</w:t>
+        <w:t>EDUCATION AND CERTIFICATION</w:t>
       </w:r>
     </w:p>
     <w:p>
@@ -1208,100 +1714,23 @@
         <w:tabs>
           <w:tab w:val="right" w:pos="10469"/>
         </w:tabs>
-        <w:spacing w:before="56" w:after="14"/>
+        <w:spacing w:after="10"/>
+      </w:pPr>
+      <w:r>
         <w:rPr>
-          <w:rFonts w:ascii="Times New Roman" w:hAnsi="Times New Roman" w:cs="Times New Roman"/>
-          <w:sz w:val="20"/>
-          <w:szCs w:val="20"/>
+          <w:b/>
         </w:rPr>
-      </w:pPr>
+        <w:t>PGP PRO, Marketing and Strategy</w:t>
+      </w:r>
+      <w:r>
+        <w:t>, Indian School of Business (ISB)</w:t>
+      </w:r>
       <w:r>
         <w:rPr>
-          <w:rFonts w:ascii="Times New Roman" w:hAnsi="Times New Roman" w:cs="Times New Roman"/>
-          <w:b/>
-          <w:i/>
-          <w:sz w:val="20"/>
-          <w:szCs w:val="20"/>
-        </w:rPr>
-        <w:t xml:space="preserve">Barclays Shared </w:t>
-      </w:r>
-      <w:proofErr w:type="gramStart"/>
-      <w:r>
-        <w:rPr>
-          <w:rFonts w:ascii="Times New Roman" w:hAnsi="Times New Roman" w:cs="Times New Roman"/>
-          <w:b/>
-          <w:i/>
-          <w:sz w:val="20"/>
-          <w:szCs w:val="20"/>
-        </w:rPr>
-        <w:t>Services  ·</w:t>
-      </w:r>
-      <w:proofErr w:type="gramEnd"/>
-      <w:r>
-        <w:rPr>
-          <w:rFonts w:ascii="Times New Roman" w:hAnsi="Times New Roman" w:cs="Times New Roman"/>
-          <w:b/>
-          <w:i/>
-          <w:sz w:val="20"/>
-          <w:szCs w:val="20"/>
-        </w:rPr>
-        <w:t xml:space="preserve">  American Express </w:t>
-      </w:r>
-      <w:proofErr w:type="gramStart"/>
-      <w:r>
-        <w:rPr>
-          <w:rFonts w:ascii="Times New Roman" w:hAnsi="Times New Roman" w:cs="Times New Roman"/>
-          <w:b/>
-          <w:i/>
-          <w:sz w:val="20"/>
-          <w:szCs w:val="20"/>
-        </w:rPr>
-        <w:t>India  ·</w:t>
-      </w:r>
-      <w:proofErr w:type="gramEnd"/>
-      <w:r>
-        <w:rPr>
-          <w:rFonts w:ascii="Times New Roman" w:hAnsi="Times New Roman" w:cs="Times New Roman"/>
-          <w:b/>
-          <w:i/>
-          <w:sz w:val="20"/>
-          <w:szCs w:val="20"/>
-        </w:rPr>
-        <w:t xml:space="preserve">  Genpact India</w:t>
-      </w:r>
-      <w:r>
-        <w:rPr>
-          <w:rFonts w:ascii="Times New Roman" w:hAnsi="Times New Roman" w:cs="Times New Roman"/>
-          <w:b/>
-          <w:i/>
-          <w:sz w:val="20"/>
-          <w:szCs w:val="20"/>
+          <w:color w:val="555F6B"/>
         </w:rPr>
         <w:tab/>
-        <w:t>Jun 2006 – Jul 2010</w:t>
-      </w:r>
-    </w:p>
-    <w:p>
-      <w:pPr>
-        <w:pBdr>
-          <w:bottom w:val="single" w:sz="8" w:space="1" w:color="000000"/>
-        </w:pBdr>
-        <w:spacing w:before="112" w:after="28"/>
-        <w:rPr>
-          <w:rFonts w:ascii="Times New Roman" w:hAnsi="Times New Roman" w:cs="Times New Roman"/>
-          <w:sz w:val="20"/>
-          <w:szCs w:val="20"/>
-        </w:rPr>
-      </w:pPr>
-      <w:r>
-        <w:rPr>
-          <w:rFonts w:ascii="Times New Roman" w:hAnsi="Times New Roman" w:cs="Times New Roman"/>
-          <w:b/>
-          <w:color w:val="2E9BD8"/>
-          <w:sz w:val="20"/>
-          <w:szCs w:val="20"/>
-        </w:rPr>
-        <w:t>EDUCATION</w:t>
+        <w:t>2025</w:t>
       </w:r>
     </w:p>
     <w:p>
@@ -1309,30 +1738,28 @@
         <w:tabs>
           <w:tab w:val="right" w:pos="10469"/>
         </w:tabs>
-        <w:spacing w:before="28"/>
+        <w:spacing w:after="10"/>
+      </w:pPr>
+      <w:r>
         <w:rPr>
-          <w:rFonts w:ascii="Times New Roman" w:hAnsi="Times New Roman" w:cs="Times New Roman"/>
-          <w:sz w:val="20"/>
-          <w:szCs w:val="20"/>
+          <w:b/>
         </w:rPr>
-      </w:pPr>
+        <w:t>AI for Founders and Business</w:t>
+      </w:r>
+      <w:r>
+        <w:t xml:space="preserve">, </w:t>
+      </w:r>
+      <w:proofErr w:type="spellStart"/>
+      <w:r>
+        <w:t>Outskill</w:t>
+      </w:r>
+      <w:proofErr w:type="spellEnd"/>
       <w:r>
         <w:rPr>
-          <w:rFonts w:ascii="Times New Roman" w:hAnsi="Times New Roman" w:cs="Times New Roman"/>
-          <w:b/>
-          <w:sz w:val="20"/>
-          <w:szCs w:val="20"/>
-        </w:rPr>
-        <w:t>Indian School of Business (ISB) – PGP PRO, Marketing and Strategy</w:t>
-      </w:r>
-      <w:r>
-        <w:rPr>
-          <w:rFonts w:ascii="Times New Roman" w:hAnsi="Times New Roman" w:cs="Times New Roman"/>
-          <w:sz w:val="20"/>
-          <w:szCs w:val="20"/>
+          <w:color w:val="555F6B"/>
         </w:rPr>
         <w:tab/>
-        <w:t>Jul 2024 – Dec 2025</w:t>
+        <w:t>2026</w:t>
       </w:r>
     </w:p>
     <w:p>
@@ -1340,27 +1767,20 @@
         <w:tabs>
           <w:tab w:val="right" w:pos="10469"/>
         </w:tabs>
-        <w:spacing w:before="28"/>
+        <w:spacing w:after="10"/>
+      </w:pPr>
+      <w:r>
         <w:rPr>
-          <w:rFonts w:ascii="Times New Roman" w:hAnsi="Times New Roman" w:cs="Times New Roman"/>
-          <w:sz w:val="20"/>
-          <w:szCs w:val="20"/>
+          <w:b/>
         </w:rPr>
-      </w:pPr>
+        <w:t>MBA, Sales and Marketing</w:t>
+      </w:r>
+      <w:r>
+        <w:t>, Anglia Ruskin University, United Kingdom</w:t>
+      </w:r>
       <w:r>
         <w:rPr>
-          <w:rFonts w:ascii="Times New Roman" w:hAnsi="Times New Roman" w:cs="Times New Roman"/>
-          <w:b/>
-          <w:sz w:val="20"/>
-          <w:szCs w:val="20"/>
-        </w:rPr>
-        <w:t>Anglia Ruskin University, United Kingdom – MBA, Sales and Marketing</w:t>
-      </w:r>
-      <w:r>
-        <w:rPr>
-          <w:rFonts w:ascii="Times New Roman" w:hAnsi="Times New Roman" w:cs="Times New Roman"/>
-          <w:sz w:val="20"/>
-          <w:szCs w:val="20"/>
+          <w:color w:val="555F6B"/>
         </w:rPr>
         <w:tab/>
         <w:t>2012</w:t>
@@ -1371,27 +1791,20 @@
         <w:tabs>
           <w:tab w:val="right" w:pos="10469"/>
         </w:tabs>
-        <w:spacing w:before="28"/>
+        <w:spacing w:after="10"/>
+      </w:pPr>
+      <w:r>
         <w:rPr>
-          <w:rFonts w:ascii="Times New Roman" w:hAnsi="Times New Roman" w:cs="Times New Roman"/>
-          <w:sz w:val="20"/>
-          <w:szCs w:val="20"/>
+          <w:b/>
         </w:rPr>
-      </w:pPr>
+        <w:t>Bachelor of Commerce</w:t>
+      </w:r>
+      <w:r>
+        <w:t>, University of Delhi</w:t>
+      </w:r>
       <w:r>
         <w:rPr>
-          <w:rFonts w:ascii="Times New Roman" w:hAnsi="Times New Roman" w:cs="Times New Roman"/>
-          <w:b/>
-          <w:sz w:val="20"/>
-          <w:szCs w:val="20"/>
-        </w:rPr>
-        <w:t>University of Delhi – Bachelor of Commerce</w:t>
-      </w:r>
-      <w:r>
-        <w:rPr>
-          <w:rFonts w:ascii="Times New Roman" w:hAnsi="Times New Roman" w:cs="Times New Roman"/>
-          <w:sz w:val="20"/>
-          <w:szCs w:val="20"/>
+          <w:color w:val="555F6B"/>
         </w:rPr>
         <w:tab/>
         <w:t>2008</w:t>
@@ -1399,92 +1812,31 @@
     </w:p>
     <w:p>
       <w:pPr>
-        <w:pBdr>
-          <w:bottom w:val="single" w:sz="8" w:space="1" w:color="000000"/>
-        </w:pBdr>
-        <w:spacing w:before="112" w:after="28"/>
+        <w:tabs>
+          <w:tab w:val="right" w:pos="10469"/>
+        </w:tabs>
+        <w:spacing w:after="10"/>
+      </w:pPr>
+      <w:r>
         <w:rPr>
-          <w:rFonts w:ascii="Times New Roman" w:hAnsi="Times New Roman" w:cs="Times New Roman"/>
-          <w:sz w:val="20"/>
-          <w:szCs w:val="20"/>
+          <w:b/>
         </w:rPr>
-      </w:pPr>
+        <w:t>Certified Digital Marketing Master</w:t>
+      </w:r>
+      <w:r>
+        <w:t>, Digital Vidya</w:t>
+      </w:r>
       <w:r>
         <w:rPr>
-          <w:rFonts w:ascii="Times New Roman" w:hAnsi="Times New Roman" w:cs="Times New Roman"/>
-          <w:b/>
-          <w:color w:val="2E9BD8"/>
-          <w:sz w:val="20"/>
-          <w:szCs w:val="20"/>
+          <w:color w:val="555F6B"/>
         </w:rPr>
-        <w:t>CERTIFICATIONS</w:t>
-      </w:r>
-    </w:p>
-    <w:p>
-      <w:pPr>
-        <w:pStyle w:val="ListBullet"/>
-        <w:rPr>
-          <w:rFonts w:ascii="Times New Roman" w:hAnsi="Times New Roman" w:cs="Times New Roman"/>
-          <w:sz w:val="20"/>
-          <w:szCs w:val="20"/>
-        </w:rPr>
-      </w:pPr>
-      <w:r>
-        <w:rPr>
-          <w:rFonts w:ascii="Times New Roman" w:hAnsi="Times New Roman" w:cs="Times New Roman"/>
-          <w:sz w:val="20"/>
-          <w:szCs w:val="20"/>
-        </w:rPr>
-        <w:t>Certified Digital Marketing Master, Digital Vidya (2014)</w:t>
-      </w:r>
-    </w:p>
-    <w:p>
-      <w:pPr>
-        <w:pStyle w:val="ListBullet"/>
-        <w:rPr>
-          <w:rFonts w:ascii="Times New Roman" w:hAnsi="Times New Roman" w:cs="Times New Roman"/>
-          <w:sz w:val="20"/>
-          <w:szCs w:val="20"/>
-        </w:rPr>
-      </w:pPr>
-      <w:r>
-        <w:rPr>
-          <w:rFonts w:ascii="Times New Roman" w:hAnsi="Times New Roman" w:cs="Times New Roman"/>
-          <w:sz w:val="20"/>
-          <w:szCs w:val="20"/>
-        </w:rPr>
-        <w:t>AI for Founders and Business</w:t>
-      </w:r>
-      <w:r>
-        <w:rPr>
-          <w:rFonts w:ascii="Times New Roman" w:hAnsi="Times New Roman" w:cs="Times New Roman"/>
-          <w:sz w:val="20"/>
-          <w:szCs w:val="20"/>
-        </w:rPr>
-        <w:t xml:space="preserve">, </w:t>
-      </w:r>
-      <w:proofErr w:type="spellStart"/>
-      <w:r>
-        <w:rPr>
-          <w:rFonts w:ascii="Times New Roman" w:hAnsi="Times New Roman" w:cs="Times New Roman"/>
-          <w:sz w:val="20"/>
-          <w:szCs w:val="20"/>
-        </w:rPr>
-        <w:t>Outskill</w:t>
-      </w:r>
-      <w:proofErr w:type="spellEnd"/>
-      <w:r>
-        <w:rPr>
-          <w:rFonts w:ascii="Times New Roman" w:hAnsi="Times New Roman" w:cs="Times New Roman"/>
-          <w:sz w:val="20"/>
-          <w:szCs w:val="20"/>
-        </w:rPr>
-        <w:t xml:space="preserve"> (2026)</w:t>
+        <w:tab/>
+        <w:t>2014</w:t>
       </w:r>
     </w:p>
     <w:sectPr>
       <w:pgSz w:w="11909" w:h="16834"/>
-      <w:pgMar w:top="720" w:right="720" w:bottom="720" w:left="720" w:header="720" w:footer="720" w:gutter="0"/>
+      <w:pgMar w:top="648" w:right="720" w:bottom="648" w:left="720" w:header="720" w:footer="720" w:gutter="0"/>
       <w:cols w:space="720"/>
       <w:docGrid w:linePitch="360"/>
     </w:sectPr>
@@ -1647,7 +1999,7 @@
   <w:abstractNum w:abstractNumId="8" w15:restartNumberingAfterBreak="0">
     <w:nsid w:val="FFFFFF89"/>
     <w:multiLevelType w:val="singleLevel"/>
-    <w:tmpl w:val="29761A62"/>
+    <w:tmpl w:val="22AA49F2"/>
     <w:lvl w:ilvl="0">
       <w:start w:val="1"/>
       <w:numFmt w:val="bullet"/>
@@ -1665,32 +2017,488 @@
       </w:rPr>
     </w:lvl>
   </w:abstractNum>
-  <w:num w:numId="1" w16cid:durableId="265502984">
+  <w:abstractNum w:abstractNumId="9" w15:restartNumberingAfterBreak="0">
+    <w:nsid w:val="06466D21"/>
+    <w:multiLevelType w:val="multilevel"/>
+    <w:tmpl w:val="8F703C94"/>
+    <w:lvl w:ilvl="0">
+      <w:start w:val="1"/>
+      <w:numFmt w:val="bullet"/>
+      <w:lvlText w:val=""/>
+      <w:lvlJc w:val="left"/>
+      <w:pPr>
+        <w:tabs>
+          <w:tab w:val="num" w:pos="720"/>
+        </w:tabs>
+        <w:ind w:left="720" w:hanging="360"/>
+      </w:pPr>
+      <w:rPr>
+        <w:rFonts w:ascii="Symbol" w:hAnsi="Symbol" w:hint="default"/>
+        <w:sz w:val="20"/>
+      </w:rPr>
+    </w:lvl>
+    <w:lvl w:ilvl="1" w:tentative="1">
+      <w:start w:val="1"/>
+      <w:numFmt w:val="bullet"/>
+      <w:lvlText w:val="o"/>
+      <w:lvlJc w:val="left"/>
+      <w:pPr>
+        <w:tabs>
+          <w:tab w:val="num" w:pos="1440"/>
+        </w:tabs>
+        <w:ind w:left="1440" w:hanging="360"/>
+      </w:pPr>
+      <w:rPr>
+        <w:rFonts w:ascii="Courier New" w:hAnsi="Courier New" w:hint="default"/>
+        <w:sz w:val="20"/>
+      </w:rPr>
+    </w:lvl>
+    <w:lvl w:ilvl="2" w:tentative="1">
+      <w:start w:val="1"/>
+      <w:numFmt w:val="bullet"/>
+      <w:lvlText w:val=""/>
+      <w:lvlJc w:val="left"/>
+      <w:pPr>
+        <w:tabs>
+          <w:tab w:val="num" w:pos="2160"/>
+        </w:tabs>
+        <w:ind w:left="2160" w:hanging="360"/>
+      </w:pPr>
+      <w:rPr>
+        <w:rFonts w:ascii="Wingdings" w:hAnsi="Wingdings" w:hint="default"/>
+        <w:sz w:val="20"/>
+      </w:rPr>
+    </w:lvl>
+    <w:lvl w:ilvl="3" w:tentative="1">
+      <w:start w:val="1"/>
+      <w:numFmt w:val="bullet"/>
+      <w:lvlText w:val=""/>
+      <w:lvlJc w:val="left"/>
+      <w:pPr>
+        <w:tabs>
+          <w:tab w:val="num" w:pos="2880"/>
+        </w:tabs>
+        <w:ind w:left="2880" w:hanging="360"/>
+      </w:pPr>
+      <w:rPr>
+        <w:rFonts w:ascii="Wingdings" w:hAnsi="Wingdings" w:hint="default"/>
+        <w:sz w:val="20"/>
+      </w:rPr>
+    </w:lvl>
+    <w:lvl w:ilvl="4" w:tentative="1">
+      <w:start w:val="1"/>
+      <w:numFmt w:val="bullet"/>
+      <w:lvlText w:val=""/>
+      <w:lvlJc w:val="left"/>
+      <w:pPr>
+        <w:tabs>
+          <w:tab w:val="num" w:pos="3600"/>
+        </w:tabs>
+        <w:ind w:left="3600" w:hanging="360"/>
+      </w:pPr>
+      <w:rPr>
+        <w:rFonts w:ascii="Wingdings" w:hAnsi="Wingdings" w:hint="default"/>
+        <w:sz w:val="20"/>
+      </w:rPr>
+    </w:lvl>
+    <w:lvl w:ilvl="5" w:tentative="1">
+      <w:start w:val="1"/>
+      <w:numFmt w:val="bullet"/>
+      <w:lvlText w:val=""/>
+      <w:lvlJc w:val="left"/>
+      <w:pPr>
+        <w:tabs>
+          <w:tab w:val="num" w:pos="4320"/>
+        </w:tabs>
+        <w:ind w:left="4320" w:hanging="360"/>
+      </w:pPr>
+      <w:rPr>
+        <w:rFonts w:ascii="Wingdings" w:hAnsi="Wingdings" w:hint="default"/>
+        <w:sz w:val="20"/>
+      </w:rPr>
+    </w:lvl>
+    <w:lvl w:ilvl="6" w:tentative="1">
+      <w:start w:val="1"/>
+      <w:numFmt w:val="bullet"/>
+      <w:lvlText w:val=""/>
+      <w:lvlJc w:val="left"/>
+      <w:pPr>
+        <w:tabs>
+          <w:tab w:val="num" w:pos="5040"/>
+        </w:tabs>
+        <w:ind w:left="5040" w:hanging="360"/>
+      </w:pPr>
+      <w:rPr>
+        <w:rFonts w:ascii="Wingdings" w:hAnsi="Wingdings" w:hint="default"/>
+        <w:sz w:val="20"/>
+      </w:rPr>
+    </w:lvl>
+    <w:lvl w:ilvl="7" w:tentative="1">
+      <w:start w:val="1"/>
+      <w:numFmt w:val="bullet"/>
+      <w:lvlText w:val=""/>
+      <w:lvlJc w:val="left"/>
+      <w:pPr>
+        <w:tabs>
+          <w:tab w:val="num" w:pos="5760"/>
+        </w:tabs>
+        <w:ind w:left="5760" w:hanging="360"/>
+      </w:pPr>
+      <w:rPr>
+        <w:rFonts w:ascii="Wingdings" w:hAnsi="Wingdings" w:hint="default"/>
+        <w:sz w:val="20"/>
+      </w:rPr>
+    </w:lvl>
+    <w:lvl w:ilvl="8" w:tentative="1">
+      <w:start w:val="1"/>
+      <w:numFmt w:val="bullet"/>
+      <w:lvlText w:val=""/>
+      <w:lvlJc w:val="left"/>
+      <w:pPr>
+        <w:tabs>
+          <w:tab w:val="num" w:pos="6480"/>
+        </w:tabs>
+        <w:ind w:left="6480" w:hanging="360"/>
+      </w:pPr>
+      <w:rPr>
+        <w:rFonts w:ascii="Wingdings" w:hAnsi="Wingdings" w:hint="default"/>
+        <w:sz w:val="20"/>
+      </w:rPr>
+    </w:lvl>
+  </w:abstractNum>
+  <w:abstractNum w:abstractNumId="10" w15:restartNumberingAfterBreak="0">
+    <w:nsid w:val="19417F4C"/>
+    <w:multiLevelType w:val="multilevel"/>
+    <w:tmpl w:val="C8E6C60A"/>
+    <w:lvl w:ilvl="0">
+      <w:start w:val="1"/>
+      <w:numFmt w:val="bullet"/>
+      <w:lvlText w:val=""/>
+      <w:lvlJc w:val="left"/>
+      <w:pPr>
+        <w:tabs>
+          <w:tab w:val="num" w:pos="720"/>
+        </w:tabs>
+        <w:ind w:left="720" w:hanging="360"/>
+      </w:pPr>
+      <w:rPr>
+        <w:rFonts w:ascii="Symbol" w:hAnsi="Symbol" w:hint="default"/>
+        <w:sz w:val="20"/>
+      </w:rPr>
+    </w:lvl>
+    <w:lvl w:ilvl="1" w:tentative="1">
+      <w:start w:val="1"/>
+      <w:numFmt w:val="bullet"/>
+      <w:lvlText w:val="o"/>
+      <w:lvlJc w:val="left"/>
+      <w:pPr>
+        <w:tabs>
+          <w:tab w:val="num" w:pos="1440"/>
+        </w:tabs>
+        <w:ind w:left="1440" w:hanging="360"/>
+      </w:pPr>
+      <w:rPr>
+        <w:rFonts w:ascii="Courier New" w:hAnsi="Courier New" w:hint="default"/>
+        <w:sz w:val="20"/>
+      </w:rPr>
+    </w:lvl>
+    <w:lvl w:ilvl="2" w:tentative="1">
+      <w:start w:val="1"/>
+      <w:numFmt w:val="bullet"/>
+      <w:lvlText w:val=""/>
+      <w:lvlJc w:val="left"/>
+      <w:pPr>
+        <w:tabs>
+          <w:tab w:val="num" w:pos="2160"/>
+        </w:tabs>
+        <w:ind w:left="2160" w:hanging="360"/>
+      </w:pPr>
+      <w:rPr>
+        <w:rFonts w:ascii="Wingdings" w:hAnsi="Wingdings" w:hint="default"/>
+        <w:sz w:val="20"/>
+      </w:rPr>
+    </w:lvl>
+    <w:lvl w:ilvl="3" w:tentative="1">
+      <w:start w:val="1"/>
+      <w:numFmt w:val="bullet"/>
+      <w:lvlText w:val=""/>
+      <w:lvlJc w:val="left"/>
+      <w:pPr>
+        <w:tabs>
+          <w:tab w:val="num" w:pos="2880"/>
+        </w:tabs>
+        <w:ind w:left="2880" w:hanging="360"/>
+      </w:pPr>
+      <w:rPr>
+        <w:rFonts w:ascii="Wingdings" w:hAnsi="Wingdings" w:hint="default"/>
+        <w:sz w:val="20"/>
+      </w:rPr>
+    </w:lvl>
+    <w:lvl w:ilvl="4" w:tentative="1">
+      <w:start w:val="1"/>
+      <w:numFmt w:val="bullet"/>
+      <w:lvlText w:val=""/>
+      <w:lvlJc w:val="left"/>
+      <w:pPr>
+        <w:tabs>
+          <w:tab w:val="num" w:pos="3600"/>
+        </w:tabs>
+        <w:ind w:left="3600" w:hanging="360"/>
+      </w:pPr>
+      <w:rPr>
+        <w:rFonts w:ascii="Wingdings" w:hAnsi="Wingdings" w:hint="default"/>
+        <w:sz w:val="20"/>
+      </w:rPr>
+    </w:lvl>
+    <w:lvl w:ilvl="5" w:tentative="1">
+      <w:start w:val="1"/>
+      <w:numFmt w:val="bullet"/>
+      <w:lvlText w:val=""/>
+      <w:lvlJc w:val="left"/>
+      <w:pPr>
+        <w:tabs>
+          <w:tab w:val="num" w:pos="4320"/>
+        </w:tabs>
+        <w:ind w:left="4320" w:hanging="360"/>
+      </w:pPr>
+      <w:rPr>
+        <w:rFonts w:ascii="Wingdings" w:hAnsi="Wingdings" w:hint="default"/>
+        <w:sz w:val="20"/>
+      </w:rPr>
+    </w:lvl>
+    <w:lvl w:ilvl="6" w:tentative="1">
+      <w:start w:val="1"/>
+      <w:numFmt w:val="bullet"/>
+      <w:lvlText w:val=""/>
+      <w:lvlJc w:val="left"/>
+      <w:pPr>
+        <w:tabs>
+          <w:tab w:val="num" w:pos="5040"/>
+        </w:tabs>
+        <w:ind w:left="5040" w:hanging="360"/>
+      </w:pPr>
+      <w:rPr>
+        <w:rFonts w:ascii="Wingdings" w:hAnsi="Wingdings" w:hint="default"/>
+        <w:sz w:val="20"/>
+      </w:rPr>
+    </w:lvl>
+    <w:lvl w:ilvl="7" w:tentative="1">
+      <w:start w:val="1"/>
+      <w:numFmt w:val="bullet"/>
+      <w:lvlText w:val=""/>
+      <w:lvlJc w:val="left"/>
+      <w:pPr>
+        <w:tabs>
+          <w:tab w:val="num" w:pos="5760"/>
+        </w:tabs>
+        <w:ind w:left="5760" w:hanging="360"/>
+      </w:pPr>
+      <w:rPr>
+        <w:rFonts w:ascii="Wingdings" w:hAnsi="Wingdings" w:hint="default"/>
+        <w:sz w:val="20"/>
+      </w:rPr>
+    </w:lvl>
+    <w:lvl w:ilvl="8" w:tentative="1">
+      <w:start w:val="1"/>
+      <w:numFmt w:val="bullet"/>
+      <w:lvlText w:val=""/>
+      <w:lvlJc w:val="left"/>
+      <w:pPr>
+        <w:tabs>
+          <w:tab w:val="num" w:pos="6480"/>
+        </w:tabs>
+        <w:ind w:left="6480" w:hanging="360"/>
+      </w:pPr>
+      <w:rPr>
+        <w:rFonts w:ascii="Wingdings" w:hAnsi="Wingdings" w:hint="default"/>
+        <w:sz w:val="20"/>
+      </w:rPr>
+    </w:lvl>
+  </w:abstractNum>
+  <w:abstractNum w:abstractNumId="11" w15:restartNumberingAfterBreak="0">
+    <w:nsid w:val="376B3A14"/>
+    <w:multiLevelType w:val="multilevel"/>
+    <w:tmpl w:val="A820496A"/>
+    <w:lvl w:ilvl="0">
+      <w:start w:val="1"/>
+      <w:numFmt w:val="bullet"/>
+      <w:lvlText w:val=""/>
+      <w:lvlJc w:val="left"/>
+      <w:pPr>
+        <w:tabs>
+          <w:tab w:val="num" w:pos="720"/>
+        </w:tabs>
+        <w:ind w:left="720" w:hanging="360"/>
+      </w:pPr>
+      <w:rPr>
+        <w:rFonts w:ascii="Symbol" w:hAnsi="Symbol" w:hint="default"/>
+        <w:sz w:val="20"/>
+      </w:rPr>
+    </w:lvl>
+    <w:lvl w:ilvl="1" w:tentative="1">
+      <w:start w:val="1"/>
+      <w:numFmt w:val="bullet"/>
+      <w:lvlText w:val="o"/>
+      <w:lvlJc w:val="left"/>
+      <w:pPr>
+        <w:tabs>
+          <w:tab w:val="num" w:pos="1440"/>
+        </w:tabs>
+        <w:ind w:left="1440" w:hanging="360"/>
+      </w:pPr>
+      <w:rPr>
+        <w:rFonts w:ascii="Courier New" w:hAnsi="Courier New" w:hint="default"/>
+        <w:sz w:val="20"/>
+      </w:rPr>
+    </w:lvl>
+    <w:lvl w:ilvl="2" w:tentative="1">
+      <w:start w:val="1"/>
+      <w:numFmt w:val="bullet"/>
+      <w:lvlText w:val=""/>
+      <w:lvlJc w:val="left"/>
+      <w:pPr>
+        <w:tabs>
+          <w:tab w:val="num" w:pos="2160"/>
+        </w:tabs>
+        <w:ind w:left="2160" w:hanging="360"/>
+      </w:pPr>
+      <w:rPr>
+        <w:rFonts w:ascii="Wingdings" w:hAnsi="Wingdings" w:hint="default"/>
+        <w:sz w:val="20"/>
+      </w:rPr>
+    </w:lvl>
+    <w:lvl w:ilvl="3" w:tentative="1">
+      <w:start w:val="1"/>
+      <w:numFmt w:val="bullet"/>
+      <w:lvlText w:val=""/>
+      <w:lvlJc w:val="left"/>
+      <w:pPr>
+        <w:tabs>
+          <w:tab w:val="num" w:pos="2880"/>
+        </w:tabs>
+        <w:ind w:left="2880" w:hanging="360"/>
+      </w:pPr>
+      <w:rPr>
+        <w:rFonts w:ascii="Wingdings" w:hAnsi="Wingdings" w:hint="default"/>
+        <w:sz w:val="20"/>
+      </w:rPr>
+    </w:lvl>
+    <w:lvl w:ilvl="4" w:tentative="1">
+      <w:start w:val="1"/>
+      <w:numFmt w:val="bullet"/>
+      <w:lvlText w:val=""/>
+      <w:lvlJc w:val="left"/>
+      <w:pPr>
+        <w:tabs>
+          <w:tab w:val="num" w:pos="3600"/>
+        </w:tabs>
+        <w:ind w:left="3600" w:hanging="360"/>
+      </w:pPr>
+      <w:rPr>
+        <w:rFonts w:ascii="Wingdings" w:hAnsi="Wingdings" w:hint="default"/>
+        <w:sz w:val="20"/>
+      </w:rPr>
+    </w:lvl>
+    <w:lvl w:ilvl="5" w:tentative="1">
+      <w:start w:val="1"/>
+      <w:numFmt w:val="bullet"/>
+      <w:lvlText w:val=""/>
+      <w:lvlJc w:val="left"/>
+      <w:pPr>
+        <w:tabs>
+          <w:tab w:val="num" w:pos="4320"/>
+        </w:tabs>
+        <w:ind w:left="4320" w:hanging="360"/>
+      </w:pPr>
+      <w:rPr>
+        <w:rFonts w:ascii="Wingdings" w:hAnsi="Wingdings" w:hint="default"/>
+        <w:sz w:val="20"/>
+      </w:rPr>
+    </w:lvl>
+    <w:lvl w:ilvl="6" w:tentative="1">
+      <w:start w:val="1"/>
+      <w:numFmt w:val="bullet"/>
+      <w:lvlText w:val=""/>
+      <w:lvlJc w:val="left"/>
+      <w:pPr>
+        <w:tabs>
+          <w:tab w:val="num" w:pos="5040"/>
+        </w:tabs>
+        <w:ind w:left="5040" w:hanging="360"/>
+      </w:pPr>
+      <w:rPr>
+        <w:rFonts w:ascii="Wingdings" w:hAnsi="Wingdings" w:hint="default"/>
+        <w:sz w:val="20"/>
+      </w:rPr>
+    </w:lvl>
+    <w:lvl w:ilvl="7" w:tentative="1">
+      <w:start w:val="1"/>
+      <w:numFmt w:val="bullet"/>
+      <w:lvlText w:val=""/>
+      <w:lvlJc w:val="left"/>
+      <w:pPr>
+        <w:tabs>
+          <w:tab w:val="num" w:pos="5760"/>
+        </w:tabs>
+        <w:ind w:left="5760" w:hanging="360"/>
+      </w:pPr>
+      <w:rPr>
+        <w:rFonts w:ascii="Wingdings" w:hAnsi="Wingdings" w:hint="default"/>
+        <w:sz w:val="20"/>
+      </w:rPr>
+    </w:lvl>
+    <w:lvl w:ilvl="8" w:tentative="1">
+      <w:start w:val="1"/>
+      <w:numFmt w:val="bullet"/>
+      <w:lvlText w:val=""/>
+      <w:lvlJc w:val="left"/>
+      <w:pPr>
+        <w:tabs>
+          <w:tab w:val="num" w:pos="6480"/>
+        </w:tabs>
+        <w:ind w:left="6480" w:hanging="360"/>
+      </w:pPr>
+      <w:rPr>
+        <w:rFonts w:ascii="Wingdings" w:hAnsi="Wingdings" w:hint="default"/>
+        <w:sz w:val="20"/>
+      </w:rPr>
+    </w:lvl>
+  </w:abstractNum>
+  <w:num w:numId="1" w16cid:durableId="1670790904">
     <w:abstractNumId w:val="8"/>
   </w:num>
-  <w:num w:numId="2" w16cid:durableId="317736093">
+  <w:num w:numId="2" w16cid:durableId="934746557">
     <w:abstractNumId w:val="6"/>
   </w:num>
-  <w:num w:numId="3" w16cid:durableId="1027102911">
+  <w:num w:numId="3" w16cid:durableId="244806689">
     <w:abstractNumId w:val="5"/>
   </w:num>
-  <w:num w:numId="4" w16cid:durableId="117726865">
+  <w:num w:numId="4" w16cid:durableId="283001855">
     <w:abstractNumId w:val="4"/>
   </w:num>
-  <w:num w:numId="5" w16cid:durableId="1216938351">
+  <w:num w:numId="5" w16cid:durableId="1279488500">
     <w:abstractNumId w:val="7"/>
   </w:num>
-  <w:num w:numId="6" w16cid:durableId="724567893">
+  <w:num w:numId="6" w16cid:durableId="933977515">
     <w:abstractNumId w:val="3"/>
   </w:num>
-  <w:num w:numId="7" w16cid:durableId="1270502010">
+  <w:num w:numId="7" w16cid:durableId="1215966619">
     <w:abstractNumId w:val="2"/>
   </w:num>
-  <w:num w:numId="8" w16cid:durableId="44720765">
+  <w:num w:numId="8" w16cid:durableId="847450713">
     <w:abstractNumId w:val="1"/>
   </w:num>
-  <w:num w:numId="9" w16cid:durableId="1929339493">
+  <w:num w:numId="9" w16cid:durableId="523860796">
     <w:abstractNumId w:val="0"/>
+  </w:num>
+  <w:num w:numId="10" w16cid:durableId="282545369">
+    <w:abstractNumId w:val="10"/>
+  </w:num>
+  <w:num w:numId="11" w16cid:durableId="658383523">
+    <w:abstractNumId w:val="9"/>
+  </w:num>
+  <w:num w:numId="12" w16cid:durableId="1597402302">
+    <w:abstractNumId w:val="11"/>
   </w:num>
 </w:numbering>
 </file>
@@ -2086,11 +2894,11 @@
     <w:qFormat/>
     <w:rsid w:val="00FC693F"/>
     <w:pPr>
-      <w:spacing w:after="0"/>
+      <w:spacing w:line="240" w:lineRule="auto"/>
     </w:pPr>
     <w:rPr>
-      <w:rFonts w:ascii="Calibri" w:hAnsi="Calibri"/>
-      <w:sz w:val="21"/>
+      <w:rFonts w:ascii="Calibri" w:eastAsia="Calibri" w:hAnsi="Calibri"/>
+      <w:sz w:val="18"/>
     </w:rPr>
   </w:style>
   <w:style w:type="paragraph" w:styleId="Heading1">
@@ -2104,7 +2912,7 @@
     <w:pPr>
       <w:keepNext/>
       <w:keepLines/>
-      <w:spacing w:before="480"/>
+      <w:spacing w:before="480" w:after="0"/>
       <w:outlineLvl w:val="0"/>
     </w:pPr>
     <w:rPr>
@@ -2128,7 +2936,7 @@
     <w:pPr>
       <w:keepNext/>
       <w:keepLines/>
-      <w:spacing w:before="200"/>
+      <w:spacing w:before="200" w:after="0"/>
       <w:outlineLvl w:val="1"/>
     </w:pPr>
     <w:rPr>
@@ -2152,7 +2960,7 @@
     <w:pPr>
       <w:keepNext/>
       <w:keepLines/>
-      <w:spacing w:before="200"/>
+      <w:spacing w:before="200" w:after="0"/>
       <w:outlineLvl w:val="2"/>
     </w:pPr>
     <w:rPr>
@@ -2175,7 +2983,7 @@
     <w:pPr>
       <w:keepNext/>
       <w:keepLines/>
-      <w:spacing w:before="200"/>
+      <w:spacing w:before="200" w:after="0"/>
       <w:outlineLvl w:val="3"/>
     </w:pPr>
     <w:rPr>
@@ -2200,7 +3008,7 @@
     <w:pPr>
       <w:keepNext/>
       <w:keepLines/>
-      <w:spacing w:before="200"/>
+      <w:spacing w:before="200" w:after="0"/>
       <w:outlineLvl w:val="4"/>
     </w:pPr>
     <w:rPr>
@@ -2221,7 +3029,7 @@
     <w:pPr>
       <w:keepNext/>
       <w:keepLines/>
-      <w:spacing w:before="200"/>
+      <w:spacing w:before="200" w:after="0"/>
       <w:outlineLvl w:val="5"/>
     </w:pPr>
     <w:rPr>
@@ -2244,7 +3052,7 @@
     <w:pPr>
       <w:keepNext/>
       <w:keepLines/>
-      <w:spacing w:before="200"/>
+      <w:spacing w:before="200" w:after="0"/>
       <w:outlineLvl w:val="6"/>
     </w:pPr>
     <w:rPr>
@@ -2267,7 +3075,7 @@
     <w:pPr>
       <w:keepNext/>
       <w:keepLines/>
-      <w:spacing w:before="200"/>
+      <w:spacing w:before="200" w:after="0"/>
       <w:outlineLvl w:val="7"/>
     </w:pPr>
     <w:rPr>
@@ -2290,7 +3098,7 @@
     <w:pPr>
       <w:keepNext/>
       <w:keepLines/>
-      <w:spacing w:before="200"/>
+      <w:spacing w:before="200" w:after="0"/>
       <w:outlineLvl w:val="8"/>
     </w:pPr>
     <w:rPr>
@@ -2341,7 +3149,7 @@
         <w:tab w:val="center" w:pos="4680"/>
         <w:tab w:val="right" w:pos="9360"/>
       </w:tabs>
-      <w:spacing w:line="240" w:lineRule="auto"/>
+      <w:spacing w:after="0"/>
     </w:pPr>
   </w:style>
   <w:style w:type="character" w:customStyle="1" w:styleId="HeaderChar">
@@ -2363,7 +3171,7 @@
         <w:tab w:val="center" w:pos="4680"/>
         <w:tab w:val="right" w:pos="9360"/>
       </w:tabs>
-      <w:spacing w:line="240" w:lineRule="auto"/>
+      <w:spacing w:after="0"/>
     </w:pPr>
   </w:style>
   <w:style w:type="character" w:customStyle="1" w:styleId="FooterChar">
@@ -2437,7 +3245,7 @@
       <w:pBdr>
         <w:bottom w:val="single" w:sz="8" w:space="4" w:color="4F81BD" w:themeColor="accent1"/>
       </w:pBdr>
-      <w:spacing w:after="300" w:line="240" w:lineRule="auto"/>
+      <w:spacing w:after="300"/>
       <w:contextualSpacing/>
     </w:pPr>
     <w:rPr>
@@ -2619,7 +3427,7 @@
       <w:numPr>
         <w:numId w:val="1"/>
       </w:numPr>
-      <w:ind w:left="317" w:hanging="216"/>
+      <w:ind w:left="288" w:hanging="202"/>
       <w:contextualSpacing/>
     </w:pPr>
   </w:style>
@@ -2880,14 +3688,10 @@
     <w:unhideWhenUsed/>
     <w:qFormat/>
     <w:rsid w:val="00FC693F"/>
-    <w:pPr>
-      <w:spacing w:line="240" w:lineRule="auto"/>
-    </w:pPr>
     <w:rPr>
       <w:b/>
       <w:bCs/>
       <w:color w:val="4F81BD" w:themeColor="accent1"/>
-      <w:sz w:val="18"/>
       <w:szCs w:val="18"/>
     </w:rPr>
   </w:style>
@@ -13082,6 +13886,78 @@
         <w:shd w:val="clear" w:color="auto" w:fill="FBCAA2" w:themeFill="accent6" w:themeFillTint="7F"/>
       </w:tcPr>
     </w:tblStylePr>
+  </w:style>
+  <w:style w:type="character" w:styleId="CommentReference">
+    <w:name w:val="annotation reference"/>
+    <w:basedOn w:val="DefaultParagraphFont"/>
+    <w:uiPriority w:val="99"/>
+    <w:semiHidden/>
+    <w:unhideWhenUsed/>
+    <w:rsid w:val="00C261C4"/>
+    <w:rPr>
+      <w:sz w:val="16"/>
+      <w:szCs w:val="16"/>
+    </w:rPr>
+  </w:style>
+  <w:style w:type="paragraph" w:styleId="CommentText">
+    <w:name w:val="annotation text"/>
+    <w:basedOn w:val="Normal"/>
+    <w:link w:val="CommentTextChar"/>
+    <w:uiPriority w:val="99"/>
+    <w:semiHidden/>
+    <w:unhideWhenUsed/>
+    <w:rsid w:val="00C261C4"/>
+    <w:rPr>
+      <w:sz w:val="20"/>
+      <w:szCs w:val="20"/>
+    </w:rPr>
+  </w:style>
+  <w:style w:type="character" w:customStyle="1" w:styleId="CommentTextChar">
+    <w:name w:val="Comment Text Char"/>
+    <w:basedOn w:val="DefaultParagraphFont"/>
+    <w:link w:val="CommentText"/>
+    <w:uiPriority w:val="99"/>
+    <w:semiHidden/>
+    <w:rsid w:val="00C261C4"/>
+    <w:rPr>
+      <w:rFonts w:ascii="Calibri" w:eastAsia="Calibri" w:hAnsi="Calibri"/>
+      <w:sz w:val="20"/>
+      <w:szCs w:val="20"/>
+    </w:rPr>
+  </w:style>
+  <w:style w:type="paragraph" w:styleId="CommentSubject">
+    <w:name w:val="annotation subject"/>
+    <w:basedOn w:val="CommentText"/>
+    <w:next w:val="CommentText"/>
+    <w:link w:val="CommentSubjectChar"/>
+    <w:uiPriority w:val="99"/>
+    <w:semiHidden/>
+    <w:unhideWhenUsed/>
+    <w:rsid w:val="00C261C4"/>
+    <w:rPr>
+      <w:b/>
+      <w:bCs/>
+    </w:rPr>
+  </w:style>
+  <w:style w:type="character" w:customStyle="1" w:styleId="CommentSubjectChar">
+    <w:name w:val="Comment Subject Char"/>
+    <w:basedOn w:val="CommentTextChar"/>
+    <w:link w:val="CommentSubject"/>
+    <w:uiPriority w:val="99"/>
+    <w:semiHidden/>
+    <w:rsid w:val="00C261C4"/>
+    <w:rPr>
+      <w:rFonts w:ascii="Calibri" w:eastAsia="Calibri" w:hAnsi="Calibri"/>
+      <w:b/>
+      <w:bCs/>
+      <w:sz w:val="20"/>
+      <w:szCs w:val="20"/>
+    </w:rPr>
+  </w:style>
+  <w:style w:type="character" w:customStyle="1" w:styleId="s1">
+    <w:name w:val="s1"/>
+    <w:basedOn w:val="DefaultParagraphFont"/>
+    <w:rsid w:val="009345F5"/>
   </w:style>
 </w:styles>
 </file>

</xml_diff>